<commit_message>
Deney 1 raporu: kılavuz cihazla gelen İngilizce kılavuzdan alındı
Co-Authored-By: Claude Sonnet 5.5 <noreply@anthropic.com>
Claude-Session: https://claude.ai/code/session_01Q71gHQtKJ86ZE2CtYTYSwP
</commit_message>
<xml_diff>
--- a/ele201l_deney1_lab/build/ELE201L_Deney1_Laboratuvar_Raporu.docx
+++ b/ele201l_deney1_lab/build/ELE201L_Deney1_Laboratuvar_Raporu.docx
@@ -3323,7 +3323,7 @@
           <w:b w:val="0"/>
           <w:i w:val="0"/>
         </w:rPr>
-        <w:t xml:space="preserve"> Seri bağlantının doğrudan ölçümü hesaplanan toplamdan %0,48, paralel bağlantının ölçümü hesaplanandan %0,39 farklı çıktı. Bu farkların ölçü aletinin doğruluğu içinde kalıp kalmadığına kılavuzdaki doğruluk değerleriyle bakalım (EK-2). Kılavuza göre direnç ölçümünün doğruluğu 20 MΩ kademesinde ±(%1 + 5 basamak), 20 kΩ kademesinde ±(%0,8 + 2 basamak)’tır. 10,45 MΩ okumasında son basamak 10 kΩ olduğundan belirsizlik ±(0,01·10,45 MΩ + 5·10 kΩ) = ±(104,5 kΩ + 50 kΩ) = ±154,5 kΩ bulunur; ölçtüğümüz fark 50,4 kΩ olduğu için bu aralığın içindedir. 0,46 kΩ okumasında son basamak 10 Ω olduğundan belirsizlik ±(0,008·460 Ω + 2·10 Ω) = ±(3,7 Ω + 20 Ω) = ±23,7 Ω bulunur; ölçtüğümüz fark 1,8 Ω olduğu için bu aralığın da içindedir. Paralel eşdeğerin en küçük dirençten (464 Ω) bile küçük çıkması bir hata değildir: paralel eklenen her yol iletkenliği artırır. Paralel eşdeğeri esas olarak en küçük direnç, seri eşdeğeri ise esas olarak en büyük direnç belirler; 100 kΩ ve 10 MΩ’luk dirençler paralel eşdeğeri yalnızca %0,5 ve %0,005 kadar etkiledi (iletkenliklerin toplamdaki payları </w:t>
+        <w:t xml:space="preserve"> Seri bağlantının doğrudan ölçümü hesaplanan toplamdan %0,48, paralel bağlantının ölçümü hesaplanandan %0,39 farklı çıktı. Bu farkların ölçü aletinin doğruluğu içinde kalıp kalmadığına kılavuzdaki doğruluk değerleriyle bakalım (EK-2). Cihazla birlikte gelen kılavuza göre direnç ölçümünün doğruluğu 20 MΩ kademesinde ±(%1,2 + 3 basamak), 20 kΩ kademesinde ±(%0,8 + 2 basamak)’tır. 10,45 MΩ okumasında son basamak 10 kΩ olduğundan belirsizlik ±(0,012·10,45 MΩ + 3·10 kΩ) = ±(125,4 kΩ + 30 kΩ) = ±155,4 kΩ bulunur; ölçtüğümüz fark 50,4 kΩ olduğu için bu aralığın içindedir. 0,46 kΩ okumasında son basamak 10 Ω olduğundan belirsizlik ±(0,008·460 Ω + 2·10 Ω) = ±(3,7 Ω + 20 Ω) = ±23,7 Ω bulunur; ölçtüğümüz fark 1,8 Ω olduğu için bu aralığın da içindedir. Paralel eşdeğerin en küçük dirençten (464 Ω) bile küçük çıkması bir hata değildir: paralel eklenen her yol iletkenliği artırır. Paralel eşdeğeri esas olarak en küçük direnç, seri eşdeğeri ise esas olarak en büyük direnç belirler; 100 kΩ ve 10 MΩ’luk dirençler paralel eşdeğeri yalnızca %0,5 ve %0,005 kadar etkiledi (iletkenliklerin toplamdaki payları </w:t>
       </w:r>
       <m:oMath>
         <m:r>
@@ -4421,7 +4421,7 @@
           <w:b w:val="0"/>
           <w:i w:val="0"/>
         </w:rPr>
-        <w:t xml:space="preserve">Multimetrenin giriş direnci, kullanım kılavuzunda bütün DA gerilim kademeleri için 10 MΩ olarak verilmiştir (EK-2). Osiloskop girişi ise Tektronix kılavuzuna göre 1 MΩ ±%2 ile 20 pF ±3 pF’ın paralel bağlantısıdır (EK-2). Örnek olarak </w:t>
+        <w:t xml:space="preserve">Multimetrenin giriş direnci, cihazla birlikte gelen kılavuzda DA gerilim için yaklaşık 10 MΩ olarak verilmiştir (EK-2). Osiloskop girişi ise Tektronix kılavuzuna göre 1 MΩ ±%2 ile 20 pF ±3 pF’ın paralel bağlantısıdır (EK-2). Örnek olarak </w:t>
       </w:r>
       <m:oMath>
         <m:r>
@@ -7071,7 +7071,95 @@
           <w:b w:val="0"/>
           <w:i w:val="0"/>
         </w:rPr>
-        <w:t xml:space="preserve">’tür. Bu değerde fark iç dirençten gelmez, çünkü kılavuza göre kaynak direnci 10 kΩ’dan küçükken multimetrenin yük etkisi %0,1’in altındadır (EK-2); fark iki direncin tam eşit olmamasından gelir: ölçtüğümüz </w:t>
+        <w:t xml:space="preserve">’tür. Bu değerde fark iç dirençten gelmez, çünkü iç direncin etkisi </w:t>
+      </w:r>
+      <m:oMath>
+        <m:r>
+          <m:t>R</m:t>
+        </m:r>
+        <m:r>
+          <m:rPr>
+            <m:sty m:val="p"/>
+          </m:rPr>
+          <m:t>/</m:t>
+        </m:r>
+        <m:sSub>
+          <m:e>
+            <m:r>
+              <m:t>R</m:t>
+            </m:r>
+          </m:e>
+          <m:sub>
+            <m:r>
+              <m:t>i</m:t>
+            </m:r>
+            <m:r>
+              <m:t>c</m:t>
+            </m:r>
+          </m:sub>
+        </m:sSub>
+        <m:r>
+          <m:rPr>
+            <m:sty m:val="p"/>
+          </m:rPr>
+          <m:t>=</m:t>
+        </m:r>
+        <m:r>
+          <m:t>470</m:t>
+        </m:r>
+        <m:r>
+          <m:rPr>
+            <m:sty m:val="p"/>
+          </m:rPr>
+          <m:t>/</m:t>
+        </m:r>
+        <m:sSup>
+          <m:e>
+            <m:r>
+              <m:t>10</m:t>
+            </m:r>
+          </m:e>
+          <m:sup>
+            <m:r>
+              <m:t>7</m:t>
+            </m:r>
+          </m:sup>
+        </m:sSup>
+        <m:r>
+          <m:rPr>
+            <m:sty m:val="p"/>
+          </m:rPr>
+          <m:t>=</m:t>
+        </m:r>
+        <m:r>
+          <m:t>0</m:t>
+        </m:r>
+        <m:r>
+          <m:rPr>
+            <m:sty m:val="p"/>
+          </m:rPr>
+          <m:t>,</m:t>
+        </m:r>
+        <m:r>
+          <m:t>005</m:t>
+        </m:r>
+        <m:r>
+          <m:t> </m:t>
+        </m:r>
+        <m:r>
+          <m:rPr>
+            <m:sty m:val="p"/>
+          </m:rPr>
+          <m:t>%</m:t>
+        </m:r>
+      </m:oMath>
+      <w:r>
+        <w:rPr>
+          <w:rFonts w:ascii="Times New Roman" w:hAnsi="Times New Roman" w:cs="Times New Roman" w:eastAsia="Times New Roman"/>
+          <w:b w:val="0"/>
+          <w:i w:val="0"/>
+        </w:rPr>
+        <w:t xml:space="preserve"> mertebesindedir; multimetrenin 20 V kademesindeki doğruluğu ±(%0,7 + 3 basamak) = ±(0,052 + 0,03) V ≈ ±0,08 V olduğundan 7,4 V okuması 7,32–7,48 V aralığını temsil eder. Fark esas olarak iki direncin tam eşit olmamasından gelir: ölçtüğümüz </w:t>
       </w:r>
       <m:oMath>
         <m:sSub>
@@ -19137,7 +19225,7 @@
           <w:b w:val="0"/>
           <w:i w:val="0"/>
         </w:rPr>
-        <w:t xml:space="preserve"> hesapladık; kılavuz 10 MΩ vermektedir. Wheatstone köprüsüyle bilinmeyen direnci </w:t>
+        <w:t xml:space="preserve"> hesapladık; kılavuz yaklaşık 10 MΩ vermektedir. Wheatstone köprüsüyle bilinmeyen direnci </w:t>
       </w:r>
       <m:oMath>
         <m:r>
@@ -19480,7 +19568,7 @@
           <w:b w:val="0"/>
           <w:i/>
         </w:rPr>
-        <w:t>UT33+ serisi (UT33A+, UT33B+, UT33D+, UT33C+) kullanım kılavuzu</w:t>
+        <w:t>UT33+ series palm size multimeter operating manual</w:t>
       </w:r>
       <w:r>
         <w:rPr>
@@ -19488,7 +19576,7 @@
           <w:b w:val="0"/>
           <w:i w:val="0"/>
         </w:rPr>
-        <w:t xml:space="preserve"> [Rusça çeviri]. https://static.chipdip.ru/lib/099/DOC017099381.pdf</w:t>
+        <w:t xml:space="preserve"> [Cihazla birlikte verilen basılı kılavuz, İngilizce]. UNI-TREND Technology (China) Co., Ltd.</w:t>
       </w:r>
     </w:p>
     <w:p>
@@ -19935,7 +20023,7 @@
           <w:b w:val="0"/>
           <w:i w:val="0"/>
         </w:rPr>
-        <w:t>Rapordaki iç direnç ve doğruluk değerleri aşağıdaki kılavuz sayfalarından alınmıştır. UT33+ kılavuzunun elimizdeki sürümü Rusça çeviridir; ilgili ifadelerin Türkçe karşılıkları şekil altlarında verilmiştir.</w:t>
+        <w:t>Rapordaki iç direnç ve doğruluk değerleri, multimetrenin kutusundan çıkan basılı İngilizce kılavuzdan ve osiloskop için Tektronix kılavuzundan alınmıştır. İlgili sayfalar aşağıdadır.</w:t>
       </w:r>
     </w:p>
     <w:p>
@@ -19947,7 +20035,7 @@
       <w:r>
         <w:drawing>
           <wp:inline xmlns:a="http://schemas.openxmlformats.org/drawingml/2006/main" xmlns:pic="http://schemas.openxmlformats.org/drawingml/2006/picture">
-            <wp:extent cx="4140000" cy="1646024"/>
+            <wp:extent cx="4680000" cy="2925000"/>
             <wp:docPr id="15" name="Picture 15"/>
             <wp:cNvGraphicFramePr>
               <a:graphicFrameLocks noChangeAspect="1"/>
@@ -19968,7 +20056,7 @@
                   <pic:spPr>
                     <a:xfrm>
                       <a:off x="0" y="0"/>
-                      <a:ext cx="4140000" cy="1646024"/>
+                      <a:ext cx="4680000" cy="2925000"/>
                     </a:xfrm>
                     <a:prstGeom prst="rect"/>
                   </pic:spPr>
@@ -19991,7 +20079,7 @@
           <w:i w:val="0"/>
           <w:sz w:val="20"/>
         </w:rPr>
-        <w:t>Şekil 5.1  UNI-T UT33+ serisi kılavuzu, sayfa 1, “Постоянное напряжение (DCV)” (DA gerilim) tablosu. Doğruluk: 200 mV–200 V kademelerinde ±(%0,5 + 2 basamak), 600 V’ta ±(%0,8 + 2). Tablonun altındaki ifadenin karşılığı: “Giriş direnci: bütün kademelerde 10 MΩ”.</w:t>
+        <w:t>Şekil 5.1  UNI-T UT33D+ kılavuzu, “IX. Technical specification”, 1. DC voltage. 20,00 V kademesinde doğruluk ±(%0,7 + 3 basamak), çözünürlük 0,01 V; “Input impedance: about 10 MΩ”.</w:t>
       </w:r>
     </w:p>
     <w:p>
@@ -20003,7 +20091,7 @@
       <w:r>
         <w:drawing>
           <wp:inline xmlns:a="http://schemas.openxmlformats.org/drawingml/2006/main" xmlns:pic="http://schemas.openxmlformats.org/drawingml/2006/picture">
-            <wp:extent cx="4140000" cy="579599"/>
+            <wp:extent cx="4680000" cy="2827500"/>
             <wp:docPr id="16" name="Picture 16"/>
             <wp:cNvGraphicFramePr>
               <a:graphicFrameLocks noChangeAspect="1"/>
@@ -20012,7 +20100,7 @@
               <a:graphicData uri="http://schemas.openxmlformats.org/drawingml/2006/picture">
                 <pic:pic>
                   <pic:nvPicPr>
-                    <pic:cNvPr id="0" name="ek_ut33_g4.png"/>
+                    <pic:cNvPr id="0" name="ek_ut33_res.png"/>
                     <pic:cNvPicPr/>
                   </pic:nvPicPr>
                   <pic:blipFill>
@@ -20024,7 +20112,7 @@
                   <pic:spPr>
                     <a:xfrm>
                       <a:off x="0" y="0"/>
-                      <a:ext cx="4140000" cy="579599"/>
+                      <a:ext cx="4680000" cy="2827500"/>
                     </a:xfrm>
                     <a:prstGeom prst="rect"/>
                   </pic:spPr>
@@ -20047,7 +20135,7 @@
           <w:i w:val="0"/>
           <w:sz w:val="20"/>
         </w:rPr>
-        <w:t>Şekil 5.2  Aynı kılavuz, sayfa 2, madde G-DCV-4. Karşılığı: “Bütün kademelerde giriş direnci 10 MΩ’dur. Bu direnç, kaynak direncinin yüksek olduğu ölçümlerde okumada sapma yaratabilir. Kaynak direnci 10 kΩ’dan küçükse bu sapma ihmal edilebilir (%0,1’den az).”</w:t>
+        <w:t>Şekil 5.2  Aynı kılavuz, 3. Resistance. 2000 Ω ve 20,00 kΩ kademelerinde ±(%0,8 + 2 basamak), 20,00 MΩ kademesinde ±(%1,2 + 3 basamak). Altta: “Measurement result = reading of resistor − reading of shorted test leads”.</w:t>
       </w:r>
     </w:p>
     <w:p>
@@ -20103,20 +20191,7 @@
           <w:i w:val="0"/>
           <w:sz w:val="20"/>
         </w:rPr>
-        <w:t>Şekil 5.3  Tektronix TBS1000 serisi servis kılavuzu, sayfa 1-1, Tablo 1-1 (TBS1022 dâhil bütün modeller için geçerli). “Input Impedance, DC Coupled: 1 MΩ ±%2, paralel 20 pF ±3 pF.”</w:t>
-      </w:r>
-    </w:p>
-    <w:p>
-      <w:pPr>
-        <w:jc w:val="both"/>
-      </w:pPr>
-      <w:r>
-        <w:rPr>
-          <w:rFonts w:ascii="Times New Roman" w:hAnsi="Times New Roman" w:cs="Times New Roman" w:eastAsia="Times New Roman"/>
-          <w:b w:val="0"/>
-          <w:i w:val="0"/>
-        </w:rPr>
-        <w:t>UT33+ kılavuzunun direnç ölçümü tablosunda (aynı kılavuz, sayfa 1) doğruluk 200 Ω kademesinde ±(%0,8 + 5 basamak), 2 kΩ–200 kΩ kademelerinde ±(%0,8 + 2 basamak), 20 MΩ kademesinde ±(%1 + 5 basamak) olarak verilmiştir; 20 kΩ kademesinde basamak 10 Ω, 20 MΩ kademesinde 10 kΩ’dur.</w:t>
+        <w:t>Şekil 5.3  Tektronix TBS1000 serisi servis kılavuzu, sayfa 1-1, Tablo 1-1 (TBS1022 dâhil bütün modeller için geçerli). “Input Impedance, DC Coupled: 1 MΩ ±2% in parallel with 20 pF ±3 pF.”</w:t>
       </w:r>
     </w:p>
     <w:sectPr>

</xml_diff>

<commit_message>
Deney 1 raporu: kapakta TOBB ETÜ armasını kullan
Co-Authored-By: Claude Haiku 5.5 <noreply@anthropic.com>
Claude-Session: https://claude.ai/code/session_01Q71gHQtKJ86ZE2CtYTYSwP
</commit_message>
<xml_diff>
--- a/ele201l_deney1_lab/build/ELE201L_Deney1_Laboratuvar_Raporu.docx
+++ b/ele201l_deney1_lab/build/ELE201L_Deney1_Laboratuvar_Raporu.docx
@@ -9,7 +9,7 @@
       <w:r>
         <w:drawing>
           <wp:inline xmlns:a="http://schemas.openxmlformats.org/drawingml/2006/main" xmlns:pic="http://schemas.openxmlformats.org/drawingml/2006/picture">
-            <wp:extent cx="5580000" cy="2072571"/>
+            <wp:extent cx="1980000" cy="1878171"/>
             <wp:docPr id="1" name="Picture 1"/>
             <wp:cNvGraphicFramePr>
               <a:graphicFrameLocks noChangeAspect="1"/>
@@ -18,7 +18,7 @@
               <a:graphicData uri="http://schemas.openxmlformats.org/drawingml/2006/picture">
                 <pic:pic>
                   <pic:nvPicPr>
-                    <pic:cNvPr id="0" name="cover_banner.png"/>
+                    <pic:cNvPr id="0" name="cover_seal.jpg"/>
                     <pic:cNvPicPr/>
                   </pic:nvPicPr>
                   <pic:blipFill>
@@ -30,7 +30,7 @@
                   <pic:spPr>
                     <a:xfrm>
                       <a:off x="0" y="0"/>
-                      <a:ext cx="5580000" cy="2072571"/>
+                      <a:ext cx="1980000" cy="1878171"/>
                     </a:xfrm>
                     <a:prstGeom prst="rect"/>
                   </pic:spPr>

</xml_diff>

<commit_message>
Deney 1 raporu: edilgen anlatım ve [n] atıfları, kaynakça üç öğe
</commit_message>
<xml_diff>
--- a/ele201l_deney1_lab/build/ELE201L_Deney1_Laboratuvar_Raporu.docx
+++ b/ele201l_deney1_lab/build/ELE201L_Deney1_Laboratuvar_Raporu.docx
@@ -374,7 +374,7 @@
           <w:b w:val="0"/>
           <w:i w:val="0"/>
         </w:rPr>
-        <w:t>Bu deneyde dört şey yaptık: (i) dirençleri seri ve paralel bağlayıp eşdeğer direnci ölçtük, (ii) gerilim bölücü devrenin çıkışını hem multimetre hem osiloskopla ölçüp ölçü aletinin devreyi nasıl etkilediğine baktık, (iii) Wheatstone köprüsüyle bilinmeyen bir direnci ölçtük ve (iv) 3 bitlik R-2R merdiven tipi sayısal-analog çevirici (DAC) devresinin çıkış gerilimini ölçtük. Her bölümde önce beklenen değeri hesapladık, sonra ölçtüğümüz değerle karşılaştırıp farkın nedenini yorumladık.</w:t>
+        <w:t>Bu deneyde dört çalışma yapılmıştır: (i) dirençler seri ve paralel bağlanarak eşdeğer direnç ölçülmüştür, (ii) gerilim bölücü devrenin çıkışı hem multimetre hem osiloskopla ölçülerek ölçü aletinin devreye etkisi incelenmiştir, (iii) Wheatstone köprüsüyle bilinmeyen bir direnç ölçülmüştür ve (iv) 3 bitlik R-2R merdiven tipi sayısal-analog çevirici (DAC) devresinin çıkış gerilimi ölçülmüştür. Her bölümde önce beklenen değer hesaplanmış, ardından ölçülen değerle karşılaştırılarak farkın nedeni yorumlanmıştır.</w:t>
       </w:r>
     </w:p>
     <w:p>
@@ -402,7 +402,7 @@
           <w:b w:val="0"/>
           <w:i w:val="0"/>
         </w:rPr>
-        <w:t>Deney sonunda şunları gördük. Direncin üzerindeki renk kodu bir hedef değerdir; gerçek değer toleransı kadar bu hedeften sapar. Ölçü aleti devreye paralel girdiği için devreyi değiştirir ve bu etki, devre direnci aletin iç direncine yaklaştıkça büyür. Köprü yönteminde sonuç bir alet okumasına değil bir denge şartına dayandığı için hassas olabilir. Sayısal bir kod, direnç ağıyla analog gerilime çevrilebilir; bu çevirinin doğruluğu direnç toleranslarına bağlıdır.</w:t>
+        <w:t>Deney sonucunda şu hususlar görülmüştür. Direncin üzerindeki renk kodu bir hedef değerdir; gerçek değer toleransı kadar bu hedeften sapar. Ölçü aleti devreye paralel girdiği için devreyi değiştirir ve bu etki, devre direnci aletin iç direncine yaklaştıkça büyür. Köprü yönteminde sonuç bir alet okumasına değil bir denge şartına dayandığı için hassas olabilir. Sayısal bir kod, direnç ağıyla analog gerilime çevrilebilir; bu çevirinin doğruluğu direnç toleranslarına bağlıdır.</w:t>
       </w:r>
     </w:p>
     <w:p>
@@ -430,7 +430,7 @@
           <w:b w:val="0"/>
           <w:i w:val="0"/>
         </w:rPr>
-        <w:t xml:space="preserve">Bütün ölçümleri laboratuvarda UNI-T UT33D+ el tipi multimetre ve Tektronix TBS 1022 osiloskopla yaptık; değerleri aletlerin ekranından okuyup kaydettik. Beklenen (kuramsal) değerleri elle hesapladık. Kuramsal değer </w:t>
+        <w:t xml:space="preserve">Bütün ölçümler laboratuvarda UNI-T UT33D+ el tipi multimetre [1] ve Tektronix TBS 1022 osiloskop [2] ile yapılmış; değerler aletlerin ekranından okunup kaydedilmiştir. Beklenen (kuramsal) değerler hesaplanmıştır. Kuramsal değer </w:t>
       </w:r>
       <m:oMath>
         <m:sSub>
@@ -474,7 +474,7 @@
           <w:b w:val="0"/>
           <w:i w:val="0"/>
         </w:rPr>
-        <w:t xml:space="preserve"> için farkı şöyle tanımladık:</w:t>
+        <w:t xml:space="preserve"> için fark şöyle tanımlanmıştır:</w:t>
       </w:r>
     </w:p>
     <w:tbl>
@@ -812,7 +812,7 @@
           <w:b w:val="0"/>
           <w:i w:val="0"/>
         </w:rPr>
-        <w:t xml:space="preserve">’dur; gerçek değerlerini aşağıda ölçtük. </w:t>
+        <w:t xml:space="preserve">’dur; gerçek değerleri aşağıda ölçülmüştür. </w:t>
       </w:r>
       <w:r>
         <w:rPr>
@@ -985,7 +985,7 @@
           <w:b w:val="0"/>
           <w:i w:val="0"/>
         </w:rPr>
-        <w:t>Dirençleri önce tek tek ölçtük (</w:t>
+        <w:t>Dirençler önce tek tek ölçülmüş (</w:t>
       </w:r>
       <w:r>
         <w:rPr>
@@ -1001,7 +1001,7 @@
           <w:b w:val="0"/>
           <w:i w:val="0"/>
         </w:rPr>
-        <w:t>), sonra seri bağlayıp toplam direnci, ardından paralel bağlayıp eşdeğer direnci ölçtük (</w:t>
+        <w:t>), ardından seri bağlanıp toplam direnç, paralel bağlanıp eşdeğer direnç ölçülmüştür (</w:t>
       </w:r>
       <w:r>
         <w:rPr>
@@ -1281,7 +1281,7 @@
           <w:b w:val="0"/>
           <w:i w:val="0"/>
         </w:rPr>
-        <w:t>Hesaplanan toplam ile doğrudan ölçümün farkını, kuramsal değere göre yüzde olarak şöyle buluruz:</w:t>
+        <w:t>Hesaplanan toplam ile doğrudan ölçümün farkı, kuramsal değere göre yüzde olarak şöyle bulunur:</w:t>
       </w:r>
     </w:p>
     <w:tbl>
@@ -1504,7 +1504,7 @@
           <w:b w:val="0"/>
           <w:i w:val="0"/>
         </w:rPr>
-        <w:t>Paralel bağlantıda her dirence aynı gerilim uygulanır ve akımlar toplanır; bu yüzden iletkenlikler toplanır:</w:t>
+        <w:t>Paralel bağlantıda her dirence aynı gerilim uygulanır ve akımlar toplanır; bu nedenle iletkenlikler toplanır:</w:t>
       </w:r>
     </w:p>
     <w:tbl>
@@ -2482,7 +2482,7 @@
           <w:i w:val="0"/>
           <w:sz w:val="20"/>
         </w:rPr>
-        <w:t>Tablo 2.1.1  Seri bağlantı ölçümleri (föy Tablo 1)</w:t>
+        <w:t>Tablo 2.1.1  Seri bağlantı ölçümleri (föy Tablo 1 [3])</w:t>
       </w:r>
     </w:p>
     <w:tbl>
@@ -2996,7 +2996,7 @@
           <w:i w:val="0"/>
           <w:sz w:val="20"/>
         </w:rPr>
-        <w:t>Tablo 2.1.2  Paralel bağlantı ölçümleri (föy Tablo 2)</w:t>
+        <w:t>Tablo 2.1.2  Paralel bağlantı ölçümleri (föy Tablo 2 [3])</w:t>
       </w:r>
     </w:p>
     <w:tbl>
@@ -3323,7 +3323,7 @@
           <w:b w:val="0"/>
           <w:i w:val="0"/>
         </w:rPr>
-        <w:t xml:space="preserve"> Seri bağlantının doğrudan ölçümü hesaplanan toplamdan %0,48, paralel bağlantının ölçümü hesaplanandan %0,39 farklı çıktı. Bu farkların ölçü aletinin doğruluğu içinde kalıp kalmadığına kılavuzdaki doğruluk değerleriyle bakalım (EK-2). Cihazla birlikte gelen kılavuza göre direnç ölçümünün doğruluğu 20 MΩ kademesinde ±(%1,2 + 3 basamak), 20 kΩ kademesinde ±(%0,8 + 2 basamak)’tır. 10,45 MΩ okumasında son basamak 10 kΩ olduğundan belirsizlik ±(0,012·10,45 MΩ + 3·10 kΩ) = ±(125,4 kΩ + 30 kΩ) = ±155,4 kΩ bulunur; ölçtüğümüz fark 50,4 kΩ olduğu için bu aralığın içindedir. 0,46 kΩ okumasında son basamak 10 Ω olduğundan belirsizlik ±(0,008·460 Ω + 2·10 Ω) = ±(3,7 Ω + 20 Ω) = ±23,7 Ω bulunur; ölçtüğümüz fark 1,8 Ω olduğu için bu aralığın da içindedir. Paralel eşdeğerin en küçük dirençten (464 Ω) bile küçük çıkması bir hata değildir: paralel eklenen her yol iletkenliği artırır. Paralel eşdeğeri esas olarak en küçük direnç, seri eşdeğeri ise esas olarak en büyük direnç belirler; 100 kΩ ve 10 MΩ’luk dirençler paralel eşdeğeri yalnızca %0,5 ve %0,005 kadar etkiledi (iletkenliklerin toplamdaki payları </w:t>
+        <w:t xml:space="preserve"> Seri bağlantının doğrudan ölçümü hesaplanan toplamdan %0,48, paralel bağlantının ölçümü hesaplanandan %0,39 farklı çıkmıştır. Bu farkların ölçü aletinin doğruluğu içinde kalıp kalmadığı, kılavuzdaki doğruluk değerleriyle incelenmiştir (EK-2). Cihazla birlikte verilen kılavuza [1] göre direnç ölçümünün doğruluğu 20 MΩ kademesinde ±(%1,2 + 3 basamak), 20 kΩ kademesinde ±(%0,8 + 2 basamak)’tır. 10,45 MΩ okumasında son basamak 10 kΩ olduğundan belirsizlik ±(0,012·10,45 MΩ + 3·10 kΩ) = ±(125,4 kΩ + 30 kΩ) = ±155,4 kΩ bulunur; ölçülen fark 50,4 kΩ olduğu için bu aralığın içindedir. 0,46 kΩ okumasında son basamak 10 Ω olduğundan belirsizlik ±(0,008·460 Ω + 2·10 Ω) = ±(3,7 Ω + 20 Ω) = ±23,7 Ω bulunur; ölçülen fark 1,8 Ω olduğu için bu aralığın da içindedir. Paralel eşdeğerin en küçük dirençten (464 Ω) bile küçük çıkması bir hata değildir: paralel eklenen her yol iletkenliği artırır. Paralel eşdeğeri esas olarak en küçük direnç, seri eşdeğeri ise esas olarak en büyük direnç belirler; 100 kΩ ve 10 MΩ’luk dirençler paralel eşdeğeri yalnızca %0,5 ve %0,005 kadar etkilemiştir (iletkenliklerin toplamdaki payları </w:t>
       </w:r>
       <m:oMath>
         <m:r>
@@ -3596,7 +3596,7 @@
           <w:b w:val="0"/>
           <w:i w:val="0"/>
         </w:rPr>
-        <w:t xml:space="preserve">Föydeki Şekil 1’deki devreyi kurduk: </w:t>
+        <w:t xml:space="preserve">Föydeki Şekil 1’deki devre [3] kurulmuştur: </w:t>
       </w:r>
       <m:oMath>
         <m:sSub>
@@ -3678,7 +3678,7 @@
           <w:b w:val="0"/>
           <w:i w:val="0"/>
         </w:rPr>
-        <w:t>’de görülmektedir. Aynı devreyi üç direnç değeri için (</w:t>
+        <w:t>’de görülmektedir. Aynı devre üç direnç değeri için (</w:t>
       </w:r>
       <m:oMath>
         <m:r>
@@ -3760,7 +3760,7 @@
           <w:b w:val="0"/>
           <w:i w:val="0"/>
         </w:rPr>
-        <w:t>) yalnızca dirençleri değiştirerek kullandık.</w:t>
+        <w:t>) yalnızca dirençler değiştirilerek kullanılmıştır.</w:t>
       </w:r>
     </w:p>
     <w:p>
@@ -4421,7 +4421,7 @@
           <w:b w:val="0"/>
           <w:i w:val="0"/>
         </w:rPr>
-        <w:t xml:space="preserve">Multimetrenin giriş direnci, cihazla birlikte gelen kılavuzda DA gerilim için yaklaşık 10 MΩ olarak verilmiştir (EK-2). Osiloskop girişi ise Tektronix kılavuzuna göre 1 MΩ ±%2 ile 20 pF ±3 pF’ın paralel bağlantısıdır (EK-2). Örnek olarak </w:t>
+        <w:t xml:space="preserve">Multimetrenin giriş direnci, cihazla birlikte verilen kılavuzda DA gerilim için yaklaşık 10 MΩ olarak verilmiştir [1]. Osiloskop girişi ise Tektronix kılavuzuna göre 1 MΩ ±%2 ile 20 pF ±3 pF’ın paralel bağlantısıdır [2]. Örnek olarak </w:t>
       </w:r>
       <m:oMath>
         <m:r>
@@ -4523,7 +4523,7 @@
           <w:b w:val="0"/>
           <w:i w:val="0"/>
         </w:rPr>
-        <w:t>’yi sayılarla yazalım:</w:t>
+        <w:t xml:space="preserve"> sayılarla yazılır:</w:t>
       </w:r>
     </w:p>
     <w:tbl>
@@ -4813,7 +4813,7 @@
           <w:b w:val="0"/>
           <w:i w:val="0"/>
         </w:rPr>
-        <w:t>Aynı hesabı osiloskop için (</w:t>
+        <w:t>Aynı hesap osiloskop için (</w:t>
       </w:r>
       <m:oMath>
         <m:sSub>
@@ -4862,7 +4862,7 @@
           <w:b w:val="0"/>
           <w:i w:val="0"/>
         </w:rPr>
-        <w:t xml:space="preserve">) ve diğer dirençler için yaptığımızda </w:t>
+        <w:t xml:space="preserve">) ve diğer dirençler için yapıldığında </w:t>
       </w:r>
       <w:r>
         <w:rPr>
@@ -4878,7 +4878,7 @@
           <w:b w:val="0"/>
           <w:i w:val="0"/>
         </w:rPr>
-        <w:t xml:space="preserve">’teki değerleri elde ettik; örneğin </w:t>
+        <w:t xml:space="preserve">’teki değerler elde edilmiştir; örneğin </w:t>
       </w:r>
       <m:oMath>
         <m:r>
@@ -6266,7 +6266,7 @@
           <w:i w:val="0"/>
           <w:sz w:val="20"/>
         </w:rPr>
-        <w:t>: DA, en küçük 7,20 V, en büyük 7,40 V, tepeden tepeye 200 mV; osiloskop değeri olarak 7,4 V aldık.</w:t>
+        <w:t>: DA, en küçük 7,20 V, en büyük 7,40 V, tepeden tepeye 200 mV; osiloskop değeri olarak 7,4 V alınmıştır.</w:t>
       </w:r>
     </w:p>
     <w:p>
@@ -6376,7 +6376,7 @@
           <w:i w:val="0"/>
           <w:sz w:val="20"/>
         </w:rPr>
-        <w:t>Tablo 2.2.2  Gerilim bölücü ölçümleri (föy Tablo 3)</w:t>
+        <w:t>Tablo 2.2.2  Gerilim bölücü ölçümleri (föy Tablo 3 [3])</w:t>
       </w:r>
     </w:p>
     <w:tbl>
@@ -6939,7 +6939,7 @@
           <w:b w:val="0"/>
           <w:i w:val="0"/>
         </w:rPr>
-        <w:t xml:space="preserve">Fark vardır ve direnç büyüdükçe çok büyüdü. </w:t>
+        <w:t xml:space="preserve">Fark vardır ve direnç büyüdükçe çok büyümüştür. </w:t>
       </w:r>
       <m:oMath>
         <m:r>
@@ -6967,7 +6967,7 @@
           <w:b w:val="0"/>
           <w:i w:val="0"/>
         </w:rPr>
-        <w:t xml:space="preserve"> iken multimetre 7,4 V, osiloskop 7,40 V gösterdi; beklenen 7,5 V olduğundan fark </w:t>
+        <w:t xml:space="preserve"> iken multimetre 7,4 V, osiloskop 7,40 V göstermiştir; beklenen 7,5 V olduğundan fark </w:t>
       </w:r>
       <m:oMath>
         <m:d>
@@ -7159,7 +7159,7 @@
           <w:b w:val="0"/>
           <w:i w:val="0"/>
         </w:rPr>
-        <w:t xml:space="preserve"> mertebesindedir; multimetrenin 20 V kademesindeki doğruluğu ±(%0,7 + 3 basamak) = ±(0,052 + 0,03) V ≈ ±0,08 V olduğundan 7,4 V okuması 7,32–7,48 V aralığını temsil eder. Fark esas olarak iki direncin tam eşit olmamasından gelir: ölçtüğümüz </w:t>
+        <w:t xml:space="preserve"> mertebesindedir; multimetrenin 20 V kademesindeki doğruluğu ±(%0,7 + 3 basamak) = ±(0,052 + 0,03) V ≈ ±0,08 V olduğundan 7,4 V okuması 7,32–7,48 V aralığını temsil eder. Fark esas olarak iki direncin tam eşit olmamasından gelir: ölçülen </w:t>
       </w:r>
       <m:oMath>
         <m:sSub>
@@ -7310,7 +7310,7 @@
           <w:b w:val="0"/>
           <w:i w:val="0"/>
         </w:rPr>
-        <w:t xml:space="preserve"> iken multimetre 6,5 V gösterdi; bu beklenenden </w:t>
+        <w:t xml:space="preserve"> iken multimetre 6,5 V göstermiştir; bu beklenenden </w:t>
       </w:r>
       <m:oMath>
         <m:d>
@@ -7436,7 +7436,7 @@
           <w:b w:val="0"/>
           <w:i w:val="0"/>
         </w:rPr>
-        <w:t xml:space="preserve"> düşük) gösterdi; yani iki alet aynı düğümde 0,9 V farklı okudu. </w:t>
+        <w:t xml:space="preserve"> düşük) göstermiştir; yani iki alet aynı düğümde 0,9 V farklı okumuştur. </w:t>
       </w:r>
       <m:oMath>
         <m:r>
@@ -7473,7 +7473,7 @@
           <w:b w:val="0"/>
           <w:i w:val="0"/>
         </w:rPr>
-        <w:t xml:space="preserve"> iken multimetre 0,9 V gösterdi, bu beklenen değerin </w:t>
+        <w:t xml:space="preserve"> iken multimetre 0,9 V göstermiş, bu beklenen değerin </w:t>
       </w:r>
       <m:oMath>
         <m:r>
@@ -7531,7 +7531,7 @@
           <w:b w:val="0"/>
           <w:i w:val="0"/>
         </w:rPr>
-        <w:t xml:space="preserve">’sidir; osiloskopta ise DA değer yerine 50 Hz’lik büyük bir sinüs gördük. Bu farkların nedeninin ölçü aletlerinin iç direnci olduğunu düşünüyoruz </w:t>
+        <w:t xml:space="preserve">’si olmuştur; osiloskopta ise DA değer yerine 50 Hz’lik büyük bir sinüs görülmüştür. Farkların nedeninin ölçü aletlerinin iç direnci olduğu düşünülmektedir </w:t>
       </w:r>
       <w:r>
         <w:rPr>
@@ -7547,7 +7547,7 @@
           <w:b w:val="0"/>
           <w:i w:val="0"/>
         </w:rPr>
-        <w:t xml:space="preserve">. Kılavuzdaki 10 MΩ ile hesapladığımız değerler </w:t>
+        <w:t xml:space="preserve">. Kılavuzdaki 10 MΩ ile hesaplanan değerler </w:t>
       </w:r>
       <m:oMath>
         <m:r>
@@ -7637,7 +7637,7 @@
           <w:b w:val="0"/>
           <w:i w:val="0"/>
         </w:rPr>
-        <w:t>); oysa 6,5 V ve 0,9 V okuduk. Yani multimetre bu ölçümlerde kılavuzdaki 10 MΩ’dan çok daha büyük bir yük gibi davrandı. Bu yükün büyüklüğünü ölçtüğümüz değerlerden aşağıda hesaplıyoruz:</w:t>
+        <w:t>); oysa 6,5 V ve 0,9 V okunmuştur. Yani multimetre bu ölçümlerde kılavuzdaki 10 MΩ’dan çok daha büyük bir yük gibi davranmıştır. Bu yükün büyüklüğü, ölçülen değerlerden aşağıda hesaplanmaktadır:</w:t>
       </w:r>
     </w:p>
     <w:p>
@@ -7700,7 +7700,7 @@
           <w:b w:val="0"/>
           <w:i w:val="0"/>
         </w:rPr>
-        <w:t xml:space="preserve"> için çözeriz. </w:t>
+        <w:t xml:space="preserve"> için çözülür. </w:t>
       </w:r>
       <m:oMath>
         <m:r>
@@ -7777,7 +7777,7 @@
           <w:b w:val="0"/>
           <w:i w:val="0"/>
         </w:rPr>
-        <w:t xml:space="preserve"> tanımıyla ve iki direncin eşit olduğunu kabul ederek </w:t>
+        <w:t xml:space="preserve"> tanımıyla ve iki direncin eşit olduğu kabul edilerek </w:t>
       </w:r>
       <m:oMath>
         <m:sSub>
@@ -9895,7 +9895,7 @@
           <w:b w:val="0"/>
           <w:i w:val="0"/>
         </w:rPr>
-        <w:t xml:space="preserve"> Hesabımıza göre multimetre bu ölçümlerde devreye yaklaşık </w:t>
+        <w:t xml:space="preserve"> Hesaba göre multimetre bu ölçümlerde devreye yaklaşık </w:t>
       </w:r>
       <m:oMath>
         <m:r>
@@ -9954,7 +9954,7 @@
           <w:b w:val="0"/>
           <w:i w:val="0"/>
         </w:rPr>
-        <w:t xml:space="preserve">’luk bir yük gibi davrandı; bu, kılavuzdaki </w:t>
+        <w:t xml:space="preserve">’luk bir yük gibi davranmıştır; bu, kılavuzdaki </w:t>
       </w:r>
       <m:oMath>
         <m:r>
@@ -10029,7 +10029,7 @@
           <w:b w:val="0"/>
           <w:i w:val="0"/>
         </w:rPr>
-        <w:t xml:space="preserve">’nin direnç değerlerine (özellikle ölçmediğimiz ikinci dirence) çok duyarlı olmasındandır. Bu farkın fiziksel nedenini belirleyemedik; bunun için aleti bilinen bir dirençle (örneğin </w:t>
+        <w:t xml:space="preserve">’nin direnç değerlerine (özellikle ölçülmeyen ikinci dirence) çok duyarlı olmasındandır. Bu farkın fiziksel nedeni belirlenememiştir; bunun için aletin bilinen bir dirençle (örneğin </w:t>
       </w:r>
       <m:oMath>
         <m:r>
@@ -10057,7 +10057,7 @@
           <w:b w:val="0"/>
           <w:i w:val="0"/>
         </w:rPr>
-        <w:t xml:space="preserve">) bir kaynağa seri bağlayıp </w:t>
+        <w:t xml:space="preserve">) bir kaynağa seri bağlanıp </w:t>
       </w:r>
       <w:r>
         <w:rPr>
@@ -10073,7 +10073,7 @@
           <w:b w:val="0"/>
           <w:i w:val="0"/>
         </w:rPr>
-        <w:t xml:space="preserve">’i ters çözmek gerekir. Osiloskop </w:t>
+        <w:t xml:space="preserve">’in ters çözülmesi gerekir. Osiloskop </w:t>
       </w:r>
       <m:oMath>
         <m:r>
@@ -10110,7 +10110,7 @@
           <w:b w:val="0"/>
           <w:i w:val="0"/>
         </w:rPr>
-        <w:t xml:space="preserve"> iken yalnızca %1,3 düşük okudu. Kılavuza göre 1 MΩ’luk girişle 7,14 V okumamız gerekirdi; 10× uçla (uç dâhil toplam giriş 10 MΩ) ise 7,46 V okurduk. Okuduğumuz 7,4 V ikinciye yakındır; uç ayarını deney sırasında not almadığımız için bunu kesin söyleyemiyoruz.</w:t>
+        <w:t xml:space="preserve"> iken yalnızca %1,3 düşük okumuştur. Kılavuza [2] göre 1 MΩ’luk girişle 7,14 V okunması gerekirdi; 10× uçla (uç dâhil toplam giriş 10 MΩ) ise 7,46 V okunurdu. Okunan 7,4 V ikinciye yakındır; uç ayarı deney sırasında kaydedilmediği için bu kesin olarak söylenemez.</w:t>
       </w:r>
     </w:p>
     <w:p>
@@ -10233,7 +10233,7 @@
           <w:b w:val="0"/>
           <w:i w:val="0"/>
         </w:rPr>
-        <w:t xml:space="preserve"> iken. Neden, iki aletin devreye farklı iç direnç göstermesidir: alt dirence paralel giren direnç ne kadar küçükse düğüm gerilimi o kadar düşer </w:t>
+        <w:t xml:space="preserve"> iken. Nedeni, iki aletin devreye farklı iç direnç göstermesidir: alt dirence paralel giren direnç ne kadar küçükse düğüm gerilimi o kadar düşer </w:t>
       </w:r>
       <w:r>
         <w:rPr>
@@ -10286,7 +10286,7 @@
           <w:b w:val="0"/>
           <w:i w:val="0"/>
         </w:rPr>
-        <w:t xml:space="preserve"> iken iç direnci yüksek görünen alet (osiloskop, 7,4 V) beklenene yakın, iç direnci düşük görünen alet (multimetre, 6,5 V) belirgin biçimde düşük okudu. </w:t>
+        <w:t xml:space="preserve"> iken iç direnci yüksek görünen alet (osiloskop, 7,4 V) beklenene yakın, iç direnci düşük görünen alet (multimetre, 6,5 V) belirgin biçimde düşük okumuştur. </w:t>
       </w:r>
       <m:oMath>
         <m:r>
@@ -10323,7 +10323,7 @@
           <w:b w:val="0"/>
           <w:i w:val="0"/>
         </w:rPr>
-        <w:t xml:space="preserve"> iken fark daha da büyüktür: multimetre 0,9 V gösterdi; osiloskopta ise DA değer yerine, en büyük değeri 9,40 V olan 50 Hz’lik bir sinüs gördük. Bu sinüs, şebekenin yüksek empedanslı düğüme kapasitif olarak kattığı paraziti gösterir: düğümün direnci (bu durumda </w:t>
+        <w:t xml:space="preserve"> iken fark daha da büyüktür: multimetre 0,9 V göstermiş; osiloskopta ise DA değer yerine, en büyük değeri 9,40 V olan 50 Hz’lik bir sinüs görülmüştür. Bu sinüs, şebekenin yüksek empedanslı düğüme kapasitif olarak kattığı paraziti gösterir: düğümün direnci (bu durumda </w:t>
       </w:r>
       <m:oMath>
         <m:r>
@@ -10399,7 +10399,7 @@
           <w:b w:val="0"/>
           <w:i w:val="0"/>
         </w:rPr>
-        <w:t>) büyük olunca aynı küçük kaçak akım büyük bir gerilim doğurur. Buradaki 9,40 V bir DA değeri değil dalganın en büyük anlık değeridir (en küçük −12,0 V, tepeden tepeye 21,4 V); bu yüzden 7,5 V ile doğrudan karşılaştırılamaz. Multimetre salınımı ortalayıp tek bir sayı gösterdiği için iki aletin buradaki farkı aslında iki ayrı olgunun farkıdır.</w:t>
+        <w:t>) büyük olunca aynı küçük kaçak akım büyük bir gerilim doğurur. Buradaki 9,40 V bir DA değeri değil dalganın en büyük anlık değeridir (en küçük −12,0 V, tepeden tepeye 21,4 V); bu nedenle 7,5 V ile doğrudan karşılaştırılamaz. Multimetre salınımı ortalayıp tek bir sayı gösterdiği için iki aletin buradaki farkı aslında iki ayrı olgunun farkıdır.</w:t>
       </w:r>
     </w:p>
     <w:p>
@@ -10609,7 +10609,7 @@
           <w:b w:val="0"/>
           <w:i w:val="0"/>
         </w:rPr>
-        <w:t xml:space="preserve"> ise okuma sıfıra yaklaşır. Ölçümlerimiz bunu gösterdi: multimetrenin görünen iç direnci yaklaşık </w:t>
+        <w:t xml:space="preserve"> ise okuma sıfıra yaklaşır. Ölçümler bunu göstermiştir: multimetrenin görünen iç direnci yaklaşık </w:t>
       </w:r>
       <m:oMath>
         <m:r>
@@ -10817,7 +10817,7 @@
           <w:b w:val="0"/>
           <w:i w:val="0"/>
         </w:rPr>
-        <w:t xml:space="preserve">) etki görmedik; </w:t>
+        <w:t xml:space="preserve">) etki görülmemiştir; </w:t>
       </w:r>
       <m:oMath>
         <m:r>
@@ -11040,7 +11040,7 @@
           <w:b w:val="0"/>
           <w:i w:val="0"/>
         </w:rPr>
-        <w:t xml:space="preserve">) 0,9 V’a düştü. Kural olarak ölçü aletinin iç direnci, ölçülen düğümün Thevenin direncinin en az 100 katı olmalıdır. Bu sağlanamıyorsa yüklü değer </w:t>
+        <w:t xml:space="preserve">) 0,9 V’a düşmüştür. Kural olarak ölçü aletinin iç direnci, ölçülen düğümün Thevenin direncinin en az 100 katı olmalıdır. Bu sağlanamıyorsa yüklü değer </w:t>
       </w:r>
       <w:r>
         <w:rPr>
@@ -11056,7 +11056,7 @@
           <w:b w:val="0"/>
           <w:i w:val="0"/>
         </w:rPr>
-        <w:t xml:space="preserve"> hesaplanmalı, daha yüksek iç dirençli bir alet (veya 10× osiloskop ucu) kullanılmalı ya da düğümün direnci küçültülmelidir.</w:t>
+        <w:t xml:space="preserve"> ile hesaplanmalı, daha yüksek iç dirençli bir alet (veya 10× osiloskop ucu) kullanılmalı ya da düğümün direnci küçültülmelidir.</w:t>
       </w:r>
     </w:p>
     <w:p>
@@ -11099,7 +11099,7 @@
           <w:b w:val="0"/>
           <w:i w:val="0"/>
         </w:rPr>
-        <w:t xml:space="preserve">Föydeki Şekil 2’deki köprüyü </w:t>
+        <w:t xml:space="preserve">Föydeki Şekil 2’deki köprü [3] </w:t>
       </w:r>
       <m:oMath>
         <m:sSub>
@@ -11136,7 +11136,7 @@
           <w:b w:val="0"/>
           <w:i w:val="0"/>
         </w:rPr>
-        <w:t xml:space="preserve"> V ile besledik; </w:t>
+        <w:t xml:space="preserve"> V ile beslenmiştir; </w:t>
       </w:r>
       <m:oMath>
         <m:sSub>
@@ -11191,7 +11191,7 @@
           <w:b w:val="0"/>
           <w:i w:val="0"/>
         </w:rPr>
-        <w:t xml:space="preserve"> (renk kodu) aldık, </w:t>
+        <w:t xml:space="preserve"> (renk kodu) alınmış, </w:t>
       </w:r>
       <m:oMath>
         <m:sSub>
@@ -11235,7 +11235,7 @@
           <w:b w:val="0"/>
           <w:i w:val="0"/>
         </w:rPr>
-        <w:t xml:space="preserve"> yerine laboratuvar asistanının verdiği bilinmeyen direnci bağladık. Devre tahtası yerleşimi </w:t>
+        <w:t xml:space="preserve"> yerine laboratuvar asistanının verdiği bilinmeyen direnç bağlanmıştır. Devre tahtası yerleşimi </w:t>
       </w:r>
       <w:r>
         <w:rPr>
@@ -12179,7 +12179,7 @@
           <w:b w:val="0"/>
           <w:i w:val="0"/>
         </w:rPr>
-        <w:t>’in dalgalanmasından etkilenmez, yalnızca direnç oranlarına bağlıdır. Ölçtüğümüz değerleri (</w:t>
+        <w:t>’in dalgalanmasından etkilenmez, yalnızca direnç oranlarına bağlıdır. Ölçülen değerler (</w:t>
       </w:r>
       <m:oMath>
         <m:sSub>
@@ -12308,7 +12308,7 @@
           <w:b w:val="0"/>
           <w:i w:val="0"/>
         </w:rPr>
-        <w:t>) kullanınca:</w:t>
+        <w:t>) kullanılınca:</w:t>
       </w:r>
     </w:p>
     <w:tbl>
@@ -12785,7 +12785,7 @@
           <w:b w:val="0"/>
           <w:i w:val="0"/>
         </w:rPr>
-        <w:t xml:space="preserve">Köprüyü, </w:t>
+        <w:t xml:space="preserve">Köprü, </w:t>
       </w:r>
       <m:oMath>
         <m:sSub>
@@ -12816,7 +12816,7 @@
           <w:b w:val="0"/>
           <w:i w:val="0"/>
         </w:rPr>
-        <w:t xml:space="preserve"> olana kadar potansiyometreyi çevirerek dengeledik; sonra potansiyometreyi devreden çıkarıp multimetreyle ölçtük ve </w:t>
+        <w:t xml:space="preserve"> olana kadar potansiyometre çevrilerek dengelenmiştir; sonra potansiyometre devreden çıkarılarak multimetreyle ölçülmüş ve </w:t>
       </w:r>
       <m:oMath>
         <m:sSub>
@@ -12871,7 +12871,7 @@
           <w:b w:val="0"/>
           <w:i w:val="0"/>
         </w:rPr>
-        <w:t xml:space="preserve"> bulduk. </w:t>
+        <w:t xml:space="preserve"> bulunmuştur. </w:t>
       </w:r>
       <m:oMath>
         <m:sSub>
@@ -12893,7 +12893,7 @@
           <w:b w:val="0"/>
           <w:i w:val="0"/>
         </w:rPr>
-        <w:t xml:space="preserve">’i de ayrıca tek başına multimetreyle ölçtük ve </w:t>
+        <w:t xml:space="preserve"> ayrıca tek başına multimetreyle ölçülmüş ve </w:t>
       </w:r>
       <m:oMath>
         <m:r>
@@ -12930,7 +12930,7 @@
           <w:b w:val="0"/>
           <w:i w:val="0"/>
         </w:rPr>
-        <w:t xml:space="preserve"> bulduk. Üzerindeki renk kodu </w:t>
+        <w:t xml:space="preserve"> bulunmuştur. Üzerindeki renk kodu </w:t>
       </w:r>
       <m:oMath>
         <m:r>
@@ -13011,7 +13011,7 @@
           <w:b w:val="0"/>
           <w:i w:val="0"/>
         </w:rPr>
-        <w:t>’ün tanımları arasında bir karışıklık olduğunu fark ettik; Tablo 4’te Wheatstone yöntemi için formülden (</w:t>
+        <w:t>’ün tanımları arasında bir karışıklık olduğu fark edilmiş; Tablo 4’te Wheatstone yöntemi için formülden (</w:t>
       </w:r>
       <w:r>
         <w:rPr>
@@ -13049,7 +13049,7 @@
           <w:b w:val="0"/>
           <w:i w:val="0"/>
         </w:rPr>
-        <w:t>’i kullandık.</w:t>
+        <w:t xml:space="preserve"> kullanılmıştır.</w:t>
       </w:r>
     </w:p>
     <w:p>
@@ -13088,7 +13088,7 @@
           <w:i w:val="0"/>
           <w:sz w:val="20"/>
         </w:rPr>
-        <w:t xml:space="preserve"> direncinin değeri ve karşılaştırılması (föy Tablo 4)</w:t>
+        <w:t xml:space="preserve"> direncinin değeri ve karşılaştırılması (föy Tablo 4 [3])</w:t>
       </w:r>
     </w:p>
     <w:tbl>
@@ -13631,7 +13631,7 @@
           <w:b w:val="0"/>
           <w:i w:val="0"/>
         </w:rPr>
-        <w:t xml:space="preserve"> arasındadır; iki ölçüm de bu aralıktadır. Farkları şöyle buluruz:</w:t>
+        <w:t xml:space="preserve"> arasındadır; iki ölçüm de bu aralıktadır. Farklar şöyle bulunur:</w:t>
       </w:r>
     </w:p>
     <w:tbl>
@@ -13898,7 +13898,7 @@
           <w:b w:val="0"/>
           <w:i w:val="0"/>
         </w:rPr>
-        <w:t xml:space="preserve"> Köprüyle 3.165 Ω, multimetreyle 3.260 Ω bulduk; fark </w:t>
+        <w:t xml:space="preserve"> Köprüyle 3.165 Ω, multimetreyle 3.260 Ω bulunmuştur; fark </w:t>
       </w:r>
       <m:oMath>
         <m:d>
@@ -13963,7 +13963,7 @@
           <w:b w:val="0"/>
           <w:i w:val="0"/>
         </w:rPr>
-        <w:t xml:space="preserve">, yani %3,0. Bu farkın ölçü aletinin doğruluğu içinde kalıp kalmadığına kılavuzdaki değerlerle bakalım (EK-2): direnç ölçümünün doğruluğu 2 kΩ ve 20 kΩ kademelerinde ±(%0,8 + 2 basamak)’tır. </w:t>
+        <w:t xml:space="preserve">, yani %3,0’dır. Bu farkın ölçü aletinin doğruluğu içinde kalıp kalmadığı kılavuzdaki değerlerle incelenmiştir (EK-2) [1]: direnç ölçümünün doğruluğu 2 kΩ ve 20 kΩ kademelerinde ±(%0,8 + 2 basamak)’tır. </w:t>
       </w:r>
       <m:oMath>
         <m:sSub>
@@ -14342,7 +14342,7 @@
           <w:b w:val="0"/>
           <w:i w:val="0"/>
         </w:rPr>
-        <w:t xml:space="preserve"> Evet: multimetre -1,21 %, köprü -4,11 % saptı ve ikisi de %5 tolerans aralığının içinde. Renk kodunun bir hedef değer olduğunu, gerçek değerin ise bu hedefin etrafında dağıldığını burada da gördük.</w:t>
+        <w:t xml:space="preserve"> Evet: multimetre -1,21 %, köprü -4,11 % saptamış ve ikisi de %5 tolerans aralığının içinde kalmıştır. Renk kodunun bir hedef değer olduğu, gerçek değerin ise bu hedefin etrafında dağıldığı burada da görülmüştür.</w:t>
       </w:r>
     </w:p>
     <w:p>
@@ -14385,7 +14385,7 @@
           <w:b w:val="0"/>
           <w:i w:val="0"/>
         </w:rPr>
-        <w:t xml:space="preserve">Föydeki Şekil 3’teki 3 bitlik R-2R merdiven DAC’ında her bit </w:t>
+        <w:t xml:space="preserve">Föydeki Şekil 3’teki [3] 3 bitlik R-2R merdiven DAC’ında her bit </w:t>
       </w:r>
       <m:oMath>
         <m:r>
@@ -14515,7 +14515,7 @@
           <w:b w:val="0"/>
           <w:i w:val="0"/>
         </w:rPr>
-        <w:t xml:space="preserve">’luk yük direncinden oluşur. Mantık “1” için girişi 16 V’a, “0” için toprağa bağladık. Devre tahtası yerleşimi </w:t>
+        <w:t xml:space="preserve">’luk yük direncinden oluşur. Mantık “1” için girişe 16 V, “0” için toprağa bağlanmıştır. Devre tahtası yerleşimi </w:t>
       </w:r>
       <w:r>
         <w:rPr>
@@ -15625,7 +15625,7 @@
           <w:b w:val="0"/>
           <w:i w:val="0"/>
         </w:rPr>
-        <w:t xml:space="preserve">Sayıları yerine koyalım: </w:t>
+        <w:t xml:space="preserve">Sayılar yerine konulursa: </w:t>
       </w:r>
       <m:oMath>
         <m:sSub>
@@ -17197,7 +17197,7 @@
           <w:b w:val="0"/>
           <w:i w:val="0"/>
         </w:rPr>
-        <w:t xml:space="preserve"> V. Aynı hesabı sadece </w:t>
+        <w:t xml:space="preserve"> V. Aynı hesap yalnızca </w:t>
       </w:r>
       <m:oMath>
         <m:sSub>
@@ -17228,7 +17228,7 @@
           <w:b w:val="0"/>
           <w:i w:val="0"/>
         </w:rPr>
-        <w:t xml:space="preserve"> için yaparsak </w:t>
+        <w:t xml:space="preserve"> için yapılırsa </w:t>
       </w:r>
       <m:oMath>
         <m:sSub>
@@ -18185,7 +18185,7 @@
           <w:b w:val="0"/>
           <w:i w:val="0"/>
         </w:rPr>
-        <w:t xml:space="preserve">Ölçtüğümüz değerlerin hepsi beklenenin üstünde çıktı: </w:t>
+        <w:t xml:space="preserve">Ölçülen değerlerin hepsi beklenenin üstünde çıkmıştır: </w:t>
       </w:r>
       <m:oMath>
         <m:d>
@@ -18416,7 +18416,7 @@
           <w:b w:val="0"/>
           <w:i w:val="0"/>
         </w:rPr>
-        <w:t xml:space="preserve">. Ölçümlerimiz birbiriyle tutarlıdır: </w:t>
+        <w:t xml:space="preserve">. Ölçümler birbiriyle tutarlıdır: </w:t>
       </w:r>
       <m:oMath>
         <m:r>
@@ -18513,7 +18513,7 @@
           <w:b w:val="0"/>
           <w:i w:val="0"/>
         </w:rPr>
-        <w:t xml:space="preserve"> için okuduğumuz değer ise </w:t>
+        <w:t xml:space="preserve"> için okunan değer ise </w:t>
       </w:r>
       <m:oMath>
         <m:r>
@@ -18563,7 +18563,7 @@
           <w:b w:val="0"/>
           <w:i w:val="0"/>
         </w:rPr>
-        <w:t xml:space="preserve"> fark); yani devre doğrusal davrandı. Ağırlıkların oranı </w:t>
+        <w:t xml:space="preserve"> fark); yani devre doğrusal davranmıştır. Ağırlıkların oranı </w:t>
       </w:r>
       <m:oMath>
         <m:r>
@@ -18621,7 +18621,7 @@
           <w:b w:val="0"/>
           <w:i w:val="0"/>
         </w:rPr>
-        <w:t xml:space="preserve"> çıktı, beklenen oran </w:t>
+        <w:t xml:space="preserve"> çıkmıştır, beklenen oran </w:t>
       </w:r>
       <m:oMath>
         <m:r>
@@ -18661,7 +18661,7 @@
           <w:b w:val="0"/>
           <w:i w:val="0"/>
         </w:rPr>
-        <w:t>’tür: bir bitin ağırlığı diğerine göre kaydı. Olası nedenler: (a) Direnç toleransları. Yedi direncin her birini ±%5 toleransın bir ucuna (</w:t>
+        <w:t>’tür: bir bitin ağırlığı diğerine göre kaymıştır. Olası nedenler: (a) Direnç toleransları. Yedi direncin her biri ±%5 toleransın bir ucuna (</w:t>
       </w:r>
       <m:oMath>
         <m:r>
@@ -18705,7 +18705,7 @@
           <w:b w:val="0"/>
           <w:i w:val="0"/>
         </w:rPr>
-        <w:t xml:space="preserve"> katına) koyarak </w:t>
+        <w:t xml:space="preserve"> katına) konularak </w:t>
       </w:r>
       <m:oMath>
         <m:sSup>
@@ -18736,7 +18736,7 @@
           <w:b w:val="0"/>
           <w:i w:val="0"/>
         </w:rPr>
-        <w:t xml:space="preserve"> kombinasyonun hepsi için düğüm denklemlerini çözdük; çıkışlar </w:t>
+        <w:t xml:space="preserve"> kombinasyonun hepsi için düğüm denklemleri çözülmüştür; çıkışlar </w:t>
       </w:r>
       <m:oMath>
         <m:r>
@@ -18907,7 +18907,7 @@
           <w:b w:val="0"/>
           <w:i w:val="0"/>
         </w:rPr>
-        <w:t xml:space="preserve"> V aralığında kaldı. Ölçtüğümüz üç değer de bu aralıktadır; ancak </w:t>
+        <w:t xml:space="preserve"> V aralığında kalmıştır. Ölçülen üç değer de bu aralıktadır; ancak </w:t>
       </w:r>
       <m:oMath>
         <m:r>
@@ -19028,7 +19028,7 @@
           <w:b w:val="0"/>
           <w:i w:val="0"/>
         </w:rPr>
-        <w:t xml:space="preserve"> gibi değerleri seri-paralel bağlamayla elde ettiysek her bağlantı kontak direnci ekler ve bit ağırlıklarını bozar. (d) Kaynağın yük altında geriliminin düşmesi. Dirençleri tek tek ölçmediğimiz için hangi nedenin baskın olduğunu söyleyemiyoruz; tek tek ölçseydik ölçülen değerleri düğüm denklemlerine koyarak sapmanın kaynağını bulabilirdik.</w:t>
+        <w:t xml:space="preserve"> gibi değerlerin seri-paralel bağlamayla elde edilmesi hâlinde her bağlantı kontak direnci ekler ve bit ağırlıklarını bozar. (d) Kaynağın yük altında geriliminin düşmesi. Dirençler tek tek ölçülmediği için hangi nedenin baskın olduğu söylenemez; tek tek ölçülseydi ölçülen değerler düğüm denklemlerine konularak sapmanın kaynağı bulunabilirdi.</w:t>
       </w:r>
     </w:p>
     <w:p>
@@ -19064,7 +19064,7 @@
           <w:b w:val="0"/>
           <w:i w:val="0"/>
         </w:rPr>
-        <w:t xml:space="preserve"> Seri ve paralel bağlantı kurallarını ölçümle doğruladık: seri ölçüm toplamdan %0,48, paralel ölçüm hesaptan %0,39 farklı çıktı ve ikisi de ölçü aletinin kılavuzdaki doğruluğu içindedir. Gerilim bölücüde asıl bulgu, ölçü aletlerinin iç direncinin sonucu belirlemesidir: </w:t>
+        <w:t xml:space="preserve"> Seri ve paralel bağlantı kuralları ölçümle doğrulanmıştır: seri ölçüm toplamdan %0,48, paralel ölçüm hesaptan %0,39 farklı çıkmış ve ikisi de ölçü aletinin kılavuzdaki doğruluğu içindedir. Gerilim bölücüde asıl bulgu, ölçü aletlerinin iç direncinin sonucu belirlemesidir: </w:t>
       </w:r>
       <m:oMath>
         <m:r>
@@ -19092,7 +19092,7 @@
           <w:b w:val="0"/>
           <w:i w:val="0"/>
         </w:rPr>
-        <w:t xml:space="preserve"> iken iki alet de beklenene yakındı (7,4 V ve 7,40 V; beklenen 7,5 V); </w:t>
+        <w:t xml:space="preserve"> iken iki alet de beklenene yakın göstermiştir (7,4 V ve 7,40 V; beklenen 7,5 V); </w:t>
       </w:r>
       <m:oMath>
         <m:r>
@@ -19129,7 +19129,7 @@
           <w:b w:val="0"/>
           <w:i w:val="0"/>
         </w:rPr>
-        <w:t xml:space="preserve"> iken multimetre 6,5 V, osiloskop 7,4 V gösterdi; </w:t>
+        <w:t xml:space="preserve"> iken multimetre 6,5 V, osiloskop 7,4 V göstermiştir; </w:t>
       </w:r>
       <m:oMath>
         <m:r>
@@ -19166,7 +19166,7 @@
           <w:b w:val="0"/>
           <w:i w:val="0"/>
         </w:rPr>
-        <w:t xml:space="preserve"> iken multimetre 0,9 V gösterdi, osiloskop ekranında ise 50 Hz’lik parazit (en büyük 9,40 V, tepeden tepeye 21,4 V) gördük. Ölçümlerden multimetrenin görünen iç direncini yaklaşık </w:t>
+        <w:t xml:space="preserve"> iken multimetre 0,9 V göstermiş, osiloskop ekranında ise 50 Hz’lik parazit (en büyük 9,40 V, tepeden tepeye 21,4 V) görülmüştür. Ölçümlerden multimetrenin görünen iç direnci yaklaşık </w:t>
       </w:r>
       <m:oMath>
         <m:r>
@@ -19225,7 +19225,7 @@
           <w:b w:val="0"/>
           <w:i w:val="0"/>
         </w:rPr>
-        <w:t xml:space="preserve"> hesapladık; kılavuz yaklaşık 10 MΩ vermektedir. Wheatstone köprüsüyle bilinmeyen direnci </w:t>
+        <w:t xml:space="preserve"> hesaplanmıştır; kılavuz yaklaşık 10 MΩ vermektedir [1]. Wheatstone köprüsüyle bilinmeyen direnç </w:t>
       </w:r>
       <m:oMath>
         <m:r>
@@ -19244,7 +19244,7 @@
           <w:b w:val="0"/>
           <w:i w:val="0"/>
         </w:rPr>
-        <w:t xml:space="preserve"> bulduk; multimetreyle ölçtüğümüz </w:t>
+        <w:t xml:space="preserve"> bulunmuştur; multimetreyle ölçülen </w:t>
       </w:r>
       <m:oMath>
         <m:r>
@@ -19300,7 +19300,7 @@
           <w:b w:val="0"/>
           <w:i w:val="0"/>
         </w:rPr>
-        <w:t xml:space="preserve"> ±%5) tolerans aralığındadır. DAC çıkışlarını beklenenden %2,3–%9 yüksek ölçtük; üç değer de ±%5 tolerans için hesapladığımız uç durum aralıklarının içindedir.</w:t>
+        <w:t xml:space="preserve"> ±%5) tolerans aralığındadır. DAC çıkışları beklenenden %2,3–%9 yüksek ölçülmüştür; üç değer de ±%5 tolerans için hesaplanan uç durum aralıklarının içindedir.</w:t>
       </w:r>
     </w:p>
     <w:p>
@@ -19395,7 +19395,7 @@
           <w:b w:val="0"/>
           <w:i w:val="0"/>
         </w:rPr>
-        <w:t xml:space="preserve"> iken kılavuzdaki 10 MΩ’dan çok küçük görünen iç direncinin nedenini belirleyemedik; bilinen bir dirençle ayrıca ölçüm yapmak gerekir. (ii) Osiloskop ucunun 1× mi 10× mu olduğunu not almadık. (iii) DAC dirençlerini tek tek ölçmedik.</w:t>
+        <w:t xml:space="preserve"> iken kılavuzdaki 10 MΩ’dan çok küçük görünen iç direncinin nedeni belirlenememiştir; bilinen bir dirençle ayrıca ölçüm yapmak gerekir. (ii) Osiloskop ucunun 1× mi 10× mu olduğu kaydedilmemiştir. (iii) DAC dirençleri tek tek ölçülmemiştir.</w:t>
       </w:r>
     </w:p>
     <w:p>
@@ -19416,7 +19416,7 @@
           <w:b w:val="0"/>
           <w:i w:val="0"/>
         </w:rPr>
-        <w:t xml:space="preserve"> Seri-paralel direnç hesabı ve ölçümü; ölçü aletinin yük etkisinin hesaplanması; osiloskop ve multimetrenin birlikte kullanımı ve 50 Hz parazitin tanınması; köprü yöntemi; DAC ağırlıklarının süperpozisyonla hesabı; devre tahtası yerleşimi ve ölçümleri beklenen değerle yüzde farkla karşılaştırma.</w:t>
+        <w:t xml:space="preserve"> Seri-paralel direnç hesabı ve ölçümü; ölçü aletinin yük etkisinin hesaplanması; osiloskop ve multimetrenin birlikte kullanımı ve 50 Hz parazitin tanınması; köprü yöntemi; DAC ağırlıklarının süperpozisyonla hesabı; devre tahtası yerleşimi ve ölçümlerinin beklenen değerle yüzde farkla karşılaştırılması.</w:t>
       </w:r>
     </w:p>
     <w:p>
@@ -19444,123 +19444,7 @@
           <w:b w:val="0"/>
           <w:i w:val="0"/>
         </w:rPr>
-        <w:t xml:space="preserve">1. Nilsson, J. W., &amp; Riedel, S. A. (2015). </w:t>
-      </w:r>
-      <w:r>
-        <w:rPr>
-          <w:rFonts w:ascii="Times New Roman" w:hAnsi="Times New Roman" w:cs="Times New Roman" w:eastAsia="Times New Roman"/>
-          <w:b w:val="0"/>
-          <w:i/>
-        </w:rPr>
-        <w:t>Electric circuits</w:t>
-      </w:r>
-      <w:r>
-        <w:rPr>
-          <w:rFonts w:ascii="Times New Roman" w:hAnsi="Times New Roman" w:cs="Times New Roman" w:eastAsia="Times New Roman"/>
-          <w:b w:val="0"/>
-          <w:i w:val="0"/>
-        </w:rPr>
-        <w:t xml:space="preserve"> (10th ed.). Boston: Pearson.</w:t>
-      </w:r>
-    </w:p>
-    <w:p>
-      <w:pPr>
-        <w:ind w:left="510" w:hanging="510"/>
-      </w:pPr>
-      <w:r>
-        <w:rPr>
-          <w:rFonts w:ascii="Times New Roman" w:hAnsi="Times New Roman" w:cs="Times New Roman" w:eastAsia="Times New Roman"/>
-          <w:b w:val="0"/>
-          <w:i w:val="0"/>
-        </w:rPr>
-        <w:t xml:space="preserve">2. Alexander, C. K., &amp; Sadiku, M. N. O. (2017). </w:t>
-      </w:r>
-      <w:r>
-        <w:rPr>
-          <w:rFonts w:ascii="Times New Roman" w:hAnsi="Times New Roman" w:cs="Times New Roman" w:eastAsia="Times New Roman"/>
-          <w:b w:val="0"/>
-          <w:i/>
-        </w:rPr>
-        <w:t>Fundamentals of electric circuits</w:t>
-      </w:r>
-      <w:r>
-        <w:rPr>
-          <w:rFonts w:ascii="Times New Roman" w:hAnsi="Times New Roman" w:cs="Times New Roman" w:eastAsia="Times New Roman"/>
-          <w:b w:val="0"/>
-          <w:i w:val="0"/>
-        </w:rPr>
-        <w:t xml:space="preserve"> (6th ed.). New York: McGraw-Hill Education.</w:t>
-      </w:r>
-    </w:p>
-    <w:p>
-      <w:pPr>
-        <w:ind w:left="510" w:hanging="510"/>
-      </w:pPr>
-      <w:r>
-        <w:rPr>
-          <w:rFonts w:ascii="Times New Roman" w:hAnsi="Times New Roman" w:cs="Times New Roman" w:eastAsia="Times New Roman"/>
-          <w:b w:val="0"/>
-          <w:i w:val="0"/>
-        </w:rPr>
-        <w:t xml:space="preserve">3. Hayt, W. H., Kemmerly, J. E., &amp; Durbin, S. M. (2012). </w:t>
-      </w:r>
-      <w:r>
-        <w:rPr>
-          <w:rFonts w:ascii="Times New Roman" w:hAnsi="Times New Roman" w:cs="Times New Roman" w:eastAsia="Times New Roman"/>
-          <w:b w:val="0"/>
-          <w:i/>
-        </w:rPr>
-        <w:t>Engineering circuit analysis</w:t>
-      </w:r>
-      <w:r>
-        <w:rPr>
-          <w:rFonts w:ascii="Times New Roman" w:hAnsi="Times New Roman" w:cs="Times New Roman" w:eastAsia="Times New Roman"/>
-          <w:b w:val="0"/>
-          <w:i w:val="0"/>
-        </w:rPr>
-        <w:t xml:space="preserve"> (8th ed.). New York: McGraw-Hill.</w:t>
-      </w:r>
-    </w:p>
-    <w:p>
-      <w:pPr>
-        <w:ind w:left="510" w:hanging="510"/>
-      </w:pPr>
-      <w:r>
-        <w:rPr>
-          <w:rFonts w:ascii="Times New Roman" w:hAnsi="Times New Roman" w:cs="Times New Roman" w:eastAsia="Times New Roman"/>
-          <w:b w:val="0"/>
-          <w:i w:val="0"/>
-        </w:rPr>
-        <w:t xml:space="preserve">4. Horowitz, P., &amp; Hill, W. (2015). </w:t>
-      </w:r>
-      <w:r>
-        <w:rPr>
-          <w:rFonts w:ascii="Times New Roman" w:hAnsi="Times New Roman" w:cs="Times New Roman" w:eastAsia="Times New Roman"/>
-          <w:b w:val="0"/>
-          <w:i/>
-        </w:rPr>
-        <w:t>The art of electronics</w:t>
-      </w:r>
-      <w:r>
-        <w:rPr>
-          <w:rFonts w:ascii="Times New Roman" w:hAnsi="Times New Roman" w:cs="Times New Roman" w:eastAsia="Times New Roman"/>
-          <w:b w:val="0"/>
-          <w:i w:val="0"/>
-        </w:rPr>
-        <w:t xml:space="preserve"> (3rd ed.). New York: Cambridge University Press.</w:t>
-      </w:r>
-    </w:p>
-    <w:p>
-      <w:pPr>
-        <w:ind w:left="510" w:hanging="510"/>
-      </w:pPr>
-      <w:r>
-        <w:rPr>
-          <w:rFonts w:ascii="Times New Roman" w:hAnsi="Times New Roman" w:cs="Times New Roman" w:eastAsia="Times New Roman"/>
-          <w:b w:val="0"/>
-          <w:i w:val="0"/>
-        </w:rPr>
-        <w:t xml:space="preserve">5. UNI-T. (t.y.). </w:t>
+        <w:t xml:space="preserve">1. UNI-T. (t.y.). </w:t>
       </w:r>
       <w:r>
         <w:rPr>
@@ -19589,7 +19473,7 @@
           <w:b w:val="0"/>
           <w:i w:val="0"/>
         </w:rPr>
-        <w:t xml:space="preserve">6. Tektronix. (t.y.). </w:t>
+        <w:t xml:space="preserve">2. Tektronix. (t.y.). </w:t>
       </w:r>
       <w:r>
         <w:rPr>
@@ -19618,7 +19502,7 @@
           <w:b w:val="0"/>
           <w:i w:val="0"/>
         </w:rPr>
-        <w:t xml:space="preserve">7. TOBB Ekonomi ve Teknoloji Üniversitesi. (2026). </w:t>
+        <w:t xml:space="preserve">3. TOBB Ekonomi ve Teknoloji Üniversitesi. (2026). </w:t>
       </w:r>
       <w:r>
         <w:rPr>
@@ -20023,7 +19907,7 @@
           <w:b w:val="0"/>
           <w:i w:val="0"/>
         </w:rPr>
-        <w:t>Rapordaki iç direnç ve doğruluk değerleri, multimetrenin kutusundan çıkan basılı İngilizce kılavuzdan ve osiloskop için Tektronix kılavuzundan alınmıştır. İlgili sayfalar aşağıdadır.</w:t>
+        <w:t>Rapordaki iç direnç ve doğruluk değerleri, multimetrenin kutusundan çıkan basılı İngilizce kılavuzdan [1] ve osiloskop için Tektronix kılavuzundan [2] alınmıştır. İlgili sayfalar aşağıdadır.</w:t>
       </w:r>
     </w:p>
     <w:p>
@@ -20079,7 +19963,7 @@
           <w:i w:val="0"/>
           <w:sz w:val="20"/>
         </w:rPr>
-        <w:t>Şekil 5.1  UNI-T UT33D+ kılavuzu, “IX. Technical specification”, 1. DC voltage. 20,00 V kademesinde doğruluk ±(%0,7 + 3 basamak), çözünürlük 0,01 V; “Input impedance: about 10 MΩ”.</w:t>
+        <w:t>Şekil 5.1  UNI-T UT33D+ kılavuzu [1], “IX. Technical specification”, 1. DC voltage. 20,00 V kademesinde doğruluk ±(%0,7 + 3 basamak), çözünürlük 0,01 V; “Input impedance: about 10 MΩ”.</w:t>
       </w:r>
     </w:p>
     <w:p>
@@ -20135,7 +20019,7 @@
           <w:i w:val="0"/>
           <w:sz w:val="20"/>
         </w:rPr>
-        <w:t>Şekil 5.2  Aynı kılavuz, 3. Resistance. 2000 Ω ve 20,00 kΩ kademelerinde ±(%0,8 + 2 basamak), 20,00 MΩ kademesinde ±(%1,2 + 3 basamak). Altta: “Measurement result = reading of resistor − reading of shorted test leads”.</w:t>
+        <w:t>Şekil 5.2  Aynı kılavuz [1], 3. Resistance. 2000 Ω ve 20,00 kΩ kademelerinde ±(%0,8 + 2 basamak), 20,00 MΩ kademesinde ±(%1,2 + 3 basamak). Altta: “Measurement result = reading of resistor − reading of shorted test leads”.</w:t>
       </w:r>
     </w:p>
     <w:p>
@@ -20191,7 +20075,7 @@
           <w:i w:val="0"/>
           <w:sz w:val="20"/>
         </w:rPr>
-        <w:t>Şekil 5.3  Tektronix TBS1000 serisi servis kılavuzu, sayfa 1-1, Tablo 1-1 (TBS1022 dâhil bütün modeller için geçerli). “Input Impedance, DC Coupled: 1 MΩ ±2% in parallel with 20 pF ±3 pF.”</w:t>
+        <w:t>Şekil 5.3  Tektronix TBS1000 serisi servis kılavuzu [2], sayfa 1-1, Tablo 1-1 (TBS1022 dâhil bütün modeller için geçerli). “Input Impedance, DC Coupled: 1 MΩ ±2% in parallel with 20 pF ±3 pF.”</w:t>
       </w:r>
     </w:p>
     <w:sectPr>

</xml_diff>

<commit_message>
Deney 1 raporu: formata göre bölüm numaraları, kapakta ortak ad ve numara alanları
</commit_message>
<xml_diff>
--- a/ele201l_deney1_lab/build/ELE201L_Deney1_Laboratuvar_Raporu.docx
+++ b/ele201l_deney1_lab/build/ELE201L_Deney1_Laboratuvar_Raporu.docx
@@ -97,7 +97,7 @@
           <w:b/>
           <w:sz w:val="32"/>
         </w:rPr>
-        <w:t>Deney 1 – Laboratuvar Raporu</w:t>
+        <w:t>Deney 1 – Deney Raporu</w:t>
       </w:r>
     </w:p>
     <w:p>
@@ -149,7 +149,7 @@
                 <w:b/>
                 <w:sz w:val="26"/>
               </w:rPr>
-              <w:t>Ad Soyad</w:t>
+              <w:t>Adı Soyadı</w:t>
             </w:r>
           </w:p>
         </w:tc>
@@ -173,7 +173,7 @@
                 <w:b w:val="0"/>
                 <w:sz w:val="26"/>
               </w:rPr>
-              <w:t>Beşir Kerem Üstüntürk</w:t>
+              <w:t>Işıl Fidancan / Bahar Işıklar / Beşir Kerem Üstüntürk</w:t>
             </w:r>
           </w:p>
         </w:tc>
@@ -223,7 +223,7 @@
                 <w:b w:val="0"/>
                 <w:sz w:val="26"/>
               </w:rPr>
-              <w:t>251201037</w:t>
+              <w:t>251201045 / 241201036 / 251201037</w:t>
             </w:r>
           </w:p>
         </w:tc>
@@ -273,57 +273,6 @@
                 <w:b w:val="0"/>
                 <w:sz w:val="26"/>
               </w:rPr>
-              <w:t>13.10.2026</w:t>
-            </w:r>
-          </w:p>
-        </w:tc>
-      </w:tr>
-      <w:tr>
-        <w:tc>
-          <w:tcPr>
-            <w:tcW w:type="dxa" w:w="2835"/>
-            <w:tcBorders>
-              <w:top w:val="single" w:sz="4" w:space="0" w:color="000000"/>
-              <w:left w:val="single" w:sz="4" w:space="0" w:color="000000"/>
-              <w:bottom w:val="single" w:sz="4" w:space="0" w:color="000000"/>
-              <w:right w:val="single" w:sz="4" w:space="0" w:color="000000"/>
-            </w:tcBorders>
-          </w:tcPr>
-          <w:p>
-            <w:pPr>
-              <w:spacing w:line="360" w:lineRule="auto"/>
-            </w:pPr>
-            <w:r>
-              <w:rPr>
-                <w:rFonts w:ascii="Times New Roman" w:hAnsi="Times New Roman" w:cs="Times New Roman" w:eastAsia="Times New Roman"/>
-                <w:b/>
-                <w:sz w:val="26"/>
-              </w:rPr>
-              <w:t>Grup Arkadaşı</w:t>
-            </w:r>
-          </w:p>
-        </w:tc>
-        <w:tc>
-          <w:tcPr>
-            <w:tcW w:type="dxa" w:w="5102"/>
-            <w:tcBorders>
-              <w:top w:val="single" w:sz="4" w:space="0" w:color="000000"/>
-              <w:left w:val="single" w:sz="4" w:space="0" w:color="000000"/>
-              <w:bottom w:val="single" w:sz="4" w:space="0" w:color="000000"/>
-              <w:right w:val="single" w:sz="4" w:space="0" w:color="000000"/>
-            </w:tcBorders>
-          </w:tcPr>
-          <w:p>
-            <w:pPr>
-              <w:spacing w:line="360" w:lineRule="auto"/>
-            </w:pPr>
-            <w:r>
-              <w:rPr>
-                <w:rFonts w:ascii="Times New Roman" w:hAnsi="Times New Roman" w:cs="Times New Roman" w:eastAsia="Times New Roman"/>
-                <w:b w:val="0"/>
-                <w:sz w:val="26"/>
-              </w:rPr>
-              <w:t>Işıl Fidancan, Bahar Işıklar</w:t>
             </w:r>
           </w:p>
         </w:tc>
@@ -346,7 +295,7 @@
           <w:i w:val="0"/>
           <w:sz w:val="24"/>
         </w:rPr>
-        <w:t>1  GİRİŞ</w:t>
+        <w:t>3  GİRİŞ</w:t>
       </w:r>
     </w:p>
     <w:p>
@@ -361,7 +310,7 @@
           <w:i w:val="0"/>
           <w:sz w:val="24"/>
         </w:rPr>
-        <w:t>1.1  Deneyin Amacı</w:t>
+        <w:t>3.1  Deneyin Amacı</w:t>
       </w:r>
     </w:p>
     <w:p>
@@ -389,7 +338,7 @@
           <w:i w:val="0"/>
           <w:sz w:val="24"/>
         </w:rPr>
-        <w:t>1.2  Deneyin Faydaları</w:t>
+        <w:t>3.2  Deneyin Faydaları</w:t>
       </w:r>
     </w:p>
     <w:p>
@@ -417,7 +366,7 @@
           <w:i w:val="0"/>
           <w:sz w:val="24"/>
         </w:rPr>
-        <w:t>2  ÖLÇÜMLER</w:t>
+        <w:t>4  ÖLÇÜMLER</w:t>
       </w:r>
     </w:p>
     <w:p>
@@ -619,7 +568,7 @@
                 <w:rFonts w:ascii="Times New Roman" w:hAnsi="Times New Roman" w:cs="Times New Roman" w:eastAsia="Times New Roman"/>
                 <w:sz w:val="24"/>
               </w:rPr>
-              <w:t>(2.1)</w:t>
+              <w:t>(4.1)</w:t>
             </w:r>
           </w:p>
         </w:tc>
@@ -655,7 +604,7 @@
           <w:i w:val="0"/>
           <w:sz w:val="24"/>
         </w:rPr>
-        <w:t>2.1  Dirençlerin Seri ve Paralel Bağlantıları</w:t>
+        <w:t>4.1  Dirençlerin Seri ve Paralel Bağlantıları</w:t>
       </w:r>
     </w:p>
     <w:p>
@@ -820,7 +769,7 @@
           <w:b w:val="0"/>
           <w:i w:val="0"/>
         </w:rPr>
-        <w:t>Şekil 2.1.1</w:t>
+        <w:t>Şekil 4.1.1</w:t>
       </w:r>
       <w:r>
         <w:rPr>
@@ -836,7 +785,7 @@
           <w:b w:val="0"/>
           <w:i w:val="0"/>
         </w:rPr>
-        <w:t>Şekil 2.1.2</w:t>
+        <w:t>Şekil 4.1.2</w:t>
       </w:r>
       <w:r>
         <w:rPr>
@@ -900,7 +849,7 @@
           <w:i w:val="0"/>
           <w:sz w:val="20"/>
         </w:rPr>
-        <w:t>Şekil 2.1.1  Dirençlerin seri bağlantısı (devre tahtası yerleşimi). Multimetre Ω kademesinde iki serbest uç arasına bağlanır.</w:t>
+        <w:t>Şekil 4.1.1  Dirençlerin seri bağlantısı (devre tahtası yerleşimi). Multimetre Ω kademesinde iki serbest uç arasına bağlanır.</w:t>
       </w:r>
     </w:p>
     <w:p>
@@ -956,7 +905,7 @@
           <w:i w:val="0"/>
           <w:sz w:val="20"/>
         </w:rPr>
-        <w:t>Şekil 2.1.2  Dirençlerin paralel bağlantısı (devre tahtası yerleşimi).</w:t>
+        <w:t>Şekil 4.1.2  Dirençlerin paralel bağlantısı (devre tahtası yerleşimi).</w:t>
       </w:r>
     </w:p>
     <w:p>
@@ -993,7 +942,7 @@
           <w:b w:val="0"/>
           <w:i w:val="0"/>
         </w:rPr>
-        <w:t>Şekil 2.1.3</w:t>
+        <w:t>Şekil 4.1.3</w:t>
       </w:r>
       <w:r>
         <w:rPr>
@@ -1009,7 +958,7 @@
           <w:b w:val="0"/>
           <w:i w:val="0"/>
         </w:rPr>
-        <w:t>Şekil 2.1.4</w:t>
+        <w:t>Şekil 4.1.4</w:t>
       </w:r>
       <w:r>
         <w:rPr>
@@ -1259,7 +1208,7 @@
                 <w:rFonts w:ascii="Times New Roman" w:hAnsi="Times New Roman" w:cs="Times New Roman" w:eastAsia="Times New Roman"/>
                 <w:sz w:val="24"/>
               </w:rPr>
-              <w:t>(2.2)</w:t>
+              <w:t>(4.2)</w:t>
             </w:r>
           </w:p>
         </w:tc>
@@ -1482,7 +1431,7 @@
                 <w:rFonts w:ascii="Times New Roman" w:hAnsi="Times New Roman" w:cs="Times New Roman" w:eastAsia="Times New Roman"/>
                 <w:sz w:val="24"/>
               </w:rPr>
-              <w:t>(2.3)</w:t>
+              <w:t>(4.3)</w:t>
             </w:r>
           </w:p>
         </w:tc>
@@ -1962,7 +1911,7 @@
                 <w:rFonts w:ascii="Times New Roman" w:hAnsi="Times New Roman" w:cs="Times New Roman" w:eastAsia="Times New Roman"/>
                 <w:sz w:val="24"/>
               </w:rPr>
-              <w:t>(2.4)</w:t>
+              <w:t>(4.4)</w:t>
             </w:r>
           </w:p>
         </w:tc>
@@ -2120,7 +2069,7 @@
                 <w:rFonts w:ascii="Times New Roman" w:hAnsi="Times New Roman" w:cs="Times New Roman" w:eastAsia="Times New Roman"/>
                 <w:sz w:val="24"/>
               </w:rPr>
-              <w:t>(2.5)</w:t>
+              <w:t>(4.5)</w:t>
             </w:r>
           </w:p>
         </w:tc>
@@ -2184,7 +2133,7 @@
           <w:i w:val="0"/>
           <w:sz w:val="20"/>
         </w:rPr>
-        <w:t xml:space="preserve">Şekil 2.1.3  Dirençlerin ayrı ayrı ölçümü: </w:t>
+        <w:t xml:space="preserve">Şekil 4.1.3  Dirençlerin ayrı ayrı ölçümü: </w:t>
       </w:r>
       <m:oMath>
         <m:sSub>
@@ -2390,7 +2339,7 @@
           <w:i w:val="0"/>
           <w:sz w:val="20"/>
         </w:rPr>
-        <w:t>Şekil 2.1.4  Seri bağlantının (</w:t>
+        <w:t>Şekil 4.1.4  Seri bağlantının (</w:t>
       </w:r>
       <m:oMath>
         <m:r>
@@ -2482,7 +2431,7 @@
           <w:i w:val="0"/>
           <w:sz w:val="20"/>
         </w:rPr>
-        <w:t>Tablo 2.1.1  Seri bağlantı ölçümleri (föy Tablo 1 [3])</w:t>
+        <w:t>Tablo 4.1.1  Seri bağlantı ölçümleri (föy Tablo 1 [3])</w:t>
       </w:r>
     </w:p>
     <w:tbl>
@@ -2996,7 +2945,7 @@
           <w:i w:val="0"/>
           <w:sz w:val="20"/>
         </w:rPr>
-        <w:t>Tablo 2.1.2  Paralel bağlantı ölçümleri (föy Tablo 2 [3])</w:t>
+        <w:t>Tablo 4.1.2  Paralel bağlantı ölçümleri (föy Tablo 2 [3])</w:t>
       </w:r>
     </w:p>
     <w:tbl>
@@ -3568,7 +3517,7 @@
           <w:i w:val="0"/>
           <w:sz w:val="24"/>
         </w:rPr>
-        <w:t>2.2  Gerilim Bölücü Devresi</w:t>
+        <w:t>4.2  Gerilim Bölücü Devresi</w:t>
       </w:r>
     </w:p>
     <w:p>
@@ -3670,7 +3619,7 @@
           <w:b w:val="0"/>
           <w:i w:val="0"/>
         </w:rPr>
-        <w:t>Şekil 2.2.1</w:t>
+        <w:t>Şekil 4.2.1</w:t>
       </w:r>
       <w:r>
         <w:rPr>
@@ -3816,7 +3765,7 @@
           <w:i w:val="0"/>
           <w:sz w:val="20"/>
         </w:rPr>
-        <w:t xml:space="preserve">Şekil 2.2.1  Gerilim bölücü devrenin devre tahtası yerleşimi. Güç kaynağı 15 V’a ayarlıdır; </w:t>
+        <w:t xml:space="preserve">Şekil 4.2.1  Gerilim bölücü devrenin devre tahtası yerleşimi. Güç kaynağı 15 V’a ayarlıdır; </w:t>
       </w:r>
       <m:oMath>
         <m:sSub>
@@ -4035,7 +3984,7 @@
                 <w:rFonts w:ascii="Times New Roman" w:hAnsi="Times New Roman" w:cs="Times New Roman" w:eastAsia="Times New Roman"/>
                 <w:sz w:val="24"/>
               </w:rPr>
-              <w:t>(2.6)</w:t>
+              <w:t>(4.6)</w:t>
             </w:r>
           </w:p>
         </w:tc>
@@ -4399,7 +4348,7 @@
                 <w:rFonts w:ascii="Times New Roman" w:hAnsi="Times New Roman" w:cs="Times New Roman" w:eastAsia="Times New Roman"/>
                 <w:sz w:val="24"/>
               </w:rPr>
-              <w:t>(2.7)</w:t>
+              <w:t>(4.7)</w:t>
             </w:r>
           </w:p>
         </w:tc>
@@ -4515,7 +4464,7 @@
           <w:b w:val="0"/>
           <w:i w:val="0"/>
         </w:rPr>
-        <w:t>(2.7)</w:t>
+        <w:t>(4.7)</w:t>
       </w:r>
       <w:r>
         <w:rPr>
@@ -4792,7 +4741,7 @@
                 <w:rFonts w:ascii="Times New Roman" w:hAnsi="Times New Roman" w:cs="Times New Roman" w:eastAsia="Times New Roman"/>
                 <w:sz w:val="24"/>
               </w:rPr>
-              <w:t>(2.8)</w:t>
+              <w:t>(4.8)</w:t>
             </w:r>
           </w:p>
         </w:tc>
@@ -4870,7 +4819,7 @@
           <w:b w:val="0"/>
           <w:i w:val="0"/>
         </w:rPr>
-        <w:t>Tablo 2.2.1</w:t>
+        <w:t>Tablo 4.2.1</w:t>
       </w:r>
       <w:r>
         <w:rPr>
@@ -5063,7 +5012,7 @@
           <w:i w:val="0"/>
           <w:sz w:val="20"/>
         </w:rPr>
-        <w:t>Tablo 2.2.1  Ölçü aletinin iç direncinin kuramsal etkisi (</w:t>
+        <w:t>Tablo 4.2.1  Ölçü aletinin iç direncinin kuramsal etkisi (</w:t>
       </w:r>
       <m:oMath>
         <m:sSub>
@@ -6009,7 +5958,7 @@
           <w:i w:val="0"/>
           <w:sz w:val="20"/>
         </w:rPr>
-        <w:t xml:space="preserve">Şekil 2.2.2  Multimetre okumaları (soldan sağa): </w:t>
+        <w:t xml:space="preserve">Şekil 4.2.2  Multimetre okumaları (soldan sağa): </w:t>
       </w:r>
       <m:oMath>
         <m:r>
@@ -6143,7 +6092,7 @@
           <w:i w:val="0"/>
           <w:sz w:val="20"/>
         </w:rPr>
-        <w:t xml:space="preserve">Şekil 2.2.3  Osiloskop ekranı, </w:t>
+        <w:t xml:space="preserve">Şekil 4.2.3  Osiloskop ekranı, </w:t>
       </w:r>
       <m:oMath>
         <m:r>
@@ -6228,7 +6177,7 @@
           <w:i w:val="0"/>
           <w:sz w:val="20"/>
         </w:rPr>
-        <w:t xml:space="preserve">Şekil 2.2.4  Osiloskop ekranı, </w:t>
+        <w:t xml:space="preserve">Şekil 4.2.4  Osiloskop ekranı, </w:t>
       </w:r>
       <m:oMath>
         <m:r>
@@ -6322,7 +6271,7 @@
           <w:i w:val="0"/>
           <w:sz w:val="20"/>
         </w:rPr>
-        <w:t xml:space="preserve">Şekil 2.2.5  Osiloskop ekranı, </w:t>
+        <w:t xml:space="preserve">Şekil 4.2.5  Osiloskop ekranı, </w:t>
       </w:r>
       <m:oMath>
         <m:r>
@@ -6376,7 +6325,7 @@
           <w:i w:val="0"/>
           <w:sz w:val="20"/>
         </w:rPr>
-        <w:t>Tablo 2.2.2  Gerilim bölücü ölçümleri (föy Tablo 3 [3])</w:t>
+        <w:t>Tablo 4.2.2  Gerilim bölücü ölçümleri (föy Tablo 3 [3])</w:t>
       </w:r>
     </w:p>
     <w:tbl>
@@ -7539,7 +7488,7 @@
           <w:b w:val="0"/>
           <w:i w:val="0"/>
         </w:rPr>
-        <w:t>(2.7)</w:t>
+        <w:t>(4.7)</w:t>
       </w:r>
       <w:r>
         <w:rPr>
@@ -7629,7 +7578,7 @@
           <w:b w:val="0"/>
           <w:i w:val="0"/>
         </w:rPr>
-        <w:t>Tablo 2.2.1</w:t>
+        <w:t>Tablo 4.2.1</w:t>
       </w:r>
       <w:r>
         <w:rPr>
@@ -7667,7 +7616,7 @@
           <w:b w:val="0"/>
           <w:i w:val="0"/>
         </w:rPr>
-        <w:t>(2.7)</w:t>
+        <w:t>(4.7)</w:t>
       </w:r>
       <w:r>
         <w:rPr>
@@ -8038,7 +7987,7 @@
                 <w:rFonts w:ascii="Times New Roman" w:hAnsi="Times New Roman" w:cs="Times New Roman" w:eastAsia="Times New Roman"/>
                 <w:sz w:val="24"/>
               </w:rPr>
-              <w:t>(2.9)</w:t>
+              <w:t>(4.9)</w:t>
             </w:r>
           </w:p>
         </w:tc>
@@ -8385,7 +8334,7 @@
                 <w:rFonts w:ascii="Times New Roman" w:hAnsi="Times New Roman" w:cs="Times New Roman" w:eastAsia="Times New Roman"/>
                 <w:sz w:val="24"/>
               </w:rPr>
-              <w:t>(2.10)</w:t>
+              <w:t>(4.10)</w:t>
             </w:r>
           </w:p>
         </w:tc>
@@ -8608,7 +8557,7 @@
                 <w:rFonts w:ascii="Times New Roman" w:hAnsi="Times New Roman" w:cs="Times New Roman" w:eastAsia="Times New Roman"/>
                 <w:sz w:val="24"/>
               </w:rPr>
-              <w:t>(2.11)</w:t>
+              <w:t>(4.11)</w:t>
             </w:r>
           </w:p>
         </w:tc>
@@ -8943,7 +8892,7 @@
                 <w:rFonts w:ascii="Times New Roman" w:hAnsi="Times New Roman" w:cs="Times New Roman" w:eastAsia="Times New Roman"/>
                 <w:sz w:val="24"/>
               </w:rPr>
-              <w:t>(2.12)</w:t>
+              <w:t>(4.12)</w:t>
             </w:r>
           </w:p>
         </w:tc>
@@ -9142,7 +9091,7 @@
                 <w:rFonts w:ascii="Times New Roman" w:hAnsi="Times New Roman" w:cs="Times New Roman" w:eastAsia="Times New Roman"/>
                 <w:sz w:val="24"/>
               </w:rPr>
-              <w:t>(2.13)</w:t>
+              <w:t>(4.13)</w:t>
             </w:r>
           </w:p>
         </w:tc>
@@ -9477,7 +9426,7 @@
                 <w:rFonts w:ascii="Times New Roman" w:hAnsi="Times New Roman" w:cs="Times New Roman" w:eastAsia="Times New Roman"/>
                 <w:sz w:val="24"/>
               </w:rPr>
-              <w:t>(2.14)</w:t>
+              <w:t>(4.14)</w:t>
             </w:r>
           </w:p>
         </w:tc>
@@ -9676,7 +9625,7 @@
                 <w:rFonts w:ascii="Times New Roman" w:hAnsi="Times New Roman" w:cs="Times New Roman" w:eastAsia="Times New Roman"/>
                 <w:sz w:val="24"/>
               </w:rPr>
-              <w:t>(2.15)</w:t>
+              <w:t>(4.15)</w:t>
             </w:r>
           </w:p>
         </w:tc>
@@ -10065,7 +10014,7 @@
           <w:b w:val="0"/>
           <w:i w:val="0"/>
         </w:rPr>
-        <w:t>(2.7)</w:t>
+        <w:t>(4.7)</w:t>
       </w:r>
       <w:r>
         <w:rPr>
@@ -10241,7 +10190,7 @@
           <w:b w:val="0"/>
           <w:i w:val="0"/>
         </w:rPr>
-        <w:t>(2.7)</w:t>
+        <w:t>(4.7)</w:t>
       </w:r>
       <w:r>
         <w:rPr>
@@ -11048,7 +10997,7 @@
           <w:b w:val="0"/>
           <w:i w:val="0"/>
         </w:rPr>
-        <w:t>(2.7)</w:t>
+        <w:t>(4.7)</w:t>
       </w:r>
       <w:r>
         <w:rPr>
@@ -11071,7 +11020,7 @@
           <w:i w:val="0"/>
           <w:sz w:val="24"/>
         </w:rPr>
-        <w:t>2.3  Wheatstone Köprüsü</w:t>
+        <w:t>4.3  Wheatstone Köprüsü</w:t>
       </w:r>
     </w:p>
     <w:p>
@@ -11243,7 +11192,7 @@
           <w:b w:val="0"/>
           <w:i w:val="0"/>
         </w:rPr>
-        <w:t>Şekil 2.3.1</w:t>
+        <w:t>Şekil 4.3.1</w:t>
       </w:r>
       <w:r>
         <w:rPr>
@@ -11417,7 +11366,7 @@
           <w:i w:val="0"/>
           <w:sz w:val="20"/>
         </w:rPr>
-        <w:t xml:space="preserve">Şekil 2.3.1  Wheatstone köprüsünün devre tahtası yerleşimi. Potansiyometre </w:t>
+        <w:t xml:space="preserve">Şekil 4.3.1  Wheatstone köprüsünün devre tahtası yerleşimi. Potansiyometre </w:t>
       </w:r>
       <m:oMath>
         <m:sSub>
@@ -12135,7 +12084,7 @@
                 <w:rFonts w:ascii="Times New Roman" w:hAnsi="Times New Roman" w:cs="Times New Roman" w:eastAsia="Times New Roman"/>
                 <w:sz w:val="24"/>
               </w:rPr>
-              <w:t>(2.16)</w:t>
+              <w:t>(4.16)</w:t>
             </w:r>
           </w:p>
         </w:tc>
@@ -12484,7 +12433,7 @@
                 <w:rFonts w:ascii="Times New Roman" w:hAnsi="Times New Roman" w:cs="Times New Roman" w:eastAsia="Times New Roman"/>
                 <w:sz w:val="24"/>
               </w:rPr>
-              <w:t>(2.17)</w:t>
+              <w:t>(4.17)</w:t>
             </w:r>
           </w:p>
         </w:tc>
@@ -12563,7 +12512,7 @@
           <w:i w:val="0"/>
           <w:sz w:val="20"/>
         </w:rPr>
-        <w:t xml:space="preserve">Şekil 2.3.2  Üst sıra: </w:t>
+        <w:t xml:space="preserve">Şekil 4.3.2  Üst sıra: </w:t>
       </w:r>
       <m:oMath>
         <m:sSub>
@@ -13019,7 +12968,7 @@
           <w:b w:val="0"/>
           <w:i w:val="0"/>
         </w:rPr>
-        <w:t>(2.16)</w:t>
+        <w:t>(4.16)</w:t>
       </w:r>
       <w:r>
         <w:rPr>
@@ -13065,7 +13014,7 @@
           <w:i w:val="0"/>
           <w:sz w:val="20"/>
         </w:rPr>
-        <w:t xml:space="preserve">Tablo 2.3.1  </w:t>
+        <w:t xml:space="preserve">Tablo 4.3.1  </w:t>
       </w:r>
       <m:oMath>
         <m:sSub>
@@ -13854,7 +13803,7 @@
                 <w:rFonts w:ascii="Times New Roman" w:hAnsi="Times New Roman" w:cs="Times New Roman" w:eastAsia="Times New Roman"/>
                 <w:sz w:val="24"/>
               </w:rPr>
-              <w:t>(2.18)</w:t>
+              <w:t>(4.18)</w:t>
             </w:r>
           </w:p>
         </w:tc>
@@ -14357,7 +14306,7 @@
           <w:i w:val="0"/>
           <w:sz w:val="24"/>
         </w:rPr>
-        <w:t>2.4  Dijital-Analog Çevirici (DAC)</w:t>
+        <w:t>4.4  Dijital-Analog Çevirici (DAC)</w:t>
       </w:r>
     </w:p>
     <w:p>
@@ -14523,7 +14472,7 @@
           <w:b w:val="0"/>
           <w:i w:val="0"/>
         </w:rPr>
-        <w:t>Şekil 2.4.1</w:t>
+        <w:t>Şekil 4.4.1</w:t>
       </w:r>
       <w:r>
         <w:rPr>
@@ -14587,7 +14536,7 @@
           <w:i w:val="0"/>
           <w:sz w:val="20"/>
         </w:rPr>
-        <w:t xml:space="preserve">Şekil 2.4.1  3 bitlik R-2R DAC’ın devre tahtası yerleşimi. </w:t>
+        <w:t xml:space="preserve">Şekil 4.4.1  3 bitlik R-2R DAC’ın devre tahtası yerleşimi. </w:t>
       </w:r>
       <m:oMath>
         <m:sSub>
@@ -15603,7 +15552,7 @@
                 <w:rFonts w:ascii="Times New Roman" w:hAnsi="Times New Roman" w:cs="Times New Roman" w:eastAsia="Times New Roman"/>
                 <w:sz w:val="24"/>
               </w:rPr>
-              <w:t>(2.19)</w:t>
+              <w:t>(4.19)</w:t>
             </w:r>
           </w:p>
         </w:tc>
@@ -16267,7 +16216,7 @@
                 <w:rFonts w:ascii="Times New Roman" w:hAnsi="Times New Roman" w:cs="Times New Roman" w:eastAsia="Times New Roman"/>
                 <w:sz w:val="24"/>
               </w:rPr>
-              <w:t>(2.20)</w:t>
+              <w:t>(4.20)</w:t>
             </w:r>
           </w:p>
         </w:tc>
@@ -17440,7 +17389,7 @@
           <w:i w:val="0"/>
           <w:sz w:val="20"/>
         </w:rPr>
-        <w:t xml:space="preserve">Şekil 2.4.2  DAC çıkış gerilimleri: 100 için </w:t>
+        <w:t xml:space="preserve">Şekil 4.4.2  DAC çıkış gerilimleri: 100 için </w:t>
       </w:r>
       <m:oMath>
         <m:r>
@@ -17525,7 +17474,7 @@
           <w:i w:val="0"/>
           <w:sz w:val="20"/>
         </w:rPr>
-        <w:t>Tablo 2.4.1  DAC çıkış gerilimleri: kuramsal ve ölçülen</w:t>
+        <w:t>Tablo 4.4.1  DAC çıkış gerilimleri: kuramsal ve ölçülen</w:t>
       </w:r>
     </w:p>
     <w:tbl>
@@ -19043,7 +18992,7 @@
           <w:i w:val="0"/>
           <w:sz w:val="24"/>
         </w:rPr>
-        <w:t>3  SONUÇLAR</w:t>
+        <w:t>5  SONUÇLAR</w:t>
       </w:r>
     </w:p>
     <w:p>
@@ -19431,7 +19380,7 @@
           <w:i w:val="0"/>
           <w:sz w:val="24"/>
         </w:rPr>
-        <w:t>4  KAYNAKLAR</w:t>
+        <w:t>6  KAYNAKLAR</w:t>
       </w:r>
     </w:p>
     <w:p>
@@ -19533,7 +19482,7 @@
           <w:i w:val="0"/>
           <w:sz w:val="24"/>
         </w:rPr>
-        <w:t>5  EKLER</w:t>
+        <w:t>7  EKLER</w:t>
       </w:r>
     </w:p>
     <w:p>
@@ -19564,7 +19513,7 @@
           <w:i w:val="0"/>
           <w:sz w:val="20"/>
         </w:rPr>
-        <w:t>Tablo 5.1  Deneyde kullanılan aletler</w:t>
+        <w:t>Tablo 7.1  Deneyde kullanılan aletler</w:t>
       </w:r>
     </w:p>
     <w:tbl>
@@ -19963,7 +19912,7 @@
           <w:i w:val="0"/>
           <w:sz w:val="20"/>
         </w:rPr>
-        <w:t>Şekil 5.1  UNI-T UT33D+ kılavuzu [1], “IX. Technical specification”, 1. DC voltage. 20,00 V kademesinde doğruluk ±(%0,7 + 3 basamak), çözünürlük 0,01 V; “Input impedance: about 10 MΩ”.</w:t>
+        <w:t>Şekil 7.1  UNI-T UT33D+ kılavuzu [1], “IX. Technical specification”, 1. DC voltage. 20,00 V kademesinde doğruluk ±(%0,7 + 3 basamak), çözünürlük 0,01 V; “Input impedance: about 10 MΩ”.</w:t>
       </w:r>
     </w:p>
     <w:p>
@@ -20019,7 +19968,7 @@
           <w:i w:val="0"/>
           <w:sz w:val="20"/>
         </w:rPr>
-        <w:t>Şekil 5.2  Aynı kılavuz [1], 3. Resistance. 2000 Ω ve 20,00 kΩ kademelerinde ±(%0,8 + 2 basamak), 20,00 MΩ kademesinde ±(%1,2 + 3 basamak). Altta: “Measurement result = reading of resistor − reading of shorted test leads”.</w:t>
+        <w:t>Şekil 7.2  Aynı kılavuz [1], 3. Resistance. 2000 Ω ve 20,00 kΩ kademelerinde ±(%0,8 + 2 basamak), 20,00 MΩ kademesinde ±(%1,2 + 3 basamak). Altta: “Measurement result = reading of resistor − reading of shorted test leads”.</w:t>
       </w:r>
     </w:p>
     <w:p>
@@ -20075,7 +20024,7 @@
           <w:i w:val="0"/>
           <w:sz w:val="20"/>
         </w:rPr>
-        <w:t>Şekil 5.3  Tektronix TBS1000 serisi servis kılavuzu [2], sayfa 1-1, Tablo 1-1 (TBS1022 dâhil bütün modeller için geçerli). “Input Impedance, DC Coupled: 1 MΩ ±2% in parallel with 20 pF ±3 pF.”</w:t>
+        <w:t>Şekil 7.3  Tektronix TBS1000 serisi servis kılavuzu [2], sayfa 1-1, Tablo 1-1 (TBS1022 dâhil bütün modeller için geçerli). “Input Impedance, DC Coupled: 1 MΩ ±2% in parallel with 20 pF ±3 pF.”</w:t>
       </w:r>
     </w:p>
     <w:sectPr>

</xml_diff>

<commit_message>
Deney 1 raporu: devre şemaları föy şekillerinden alındı, breadboard görselleri kaldırıldı, tarih 19.10.2026
</commit_message>
<xml_diff>
--- a/ele201l_deney1_lab/build/ELE201L_Deney1_Laboratuvar_Raporu.docx
+++ b/ele201l_deney1_lab/build/ELE201L_Deney1_Laboratuvar_Raporu.docx
@@ -273,6 +273,7 @@
                 <w:b w:val="0"/>
                 <w:sz w:val="26"/>
               </w:rPr>
+              <w:t>19.10.2026</w:t>
             </w:r>
           </w:p>
         </w:tc>
@@ -609,21 +610,6 @@
     </w:p>
     <w:p>
       <w:pPr>
-        <w:keepNext/>
-        <w:spacing w:before="120" w:after="120"/>
-      </w:pPr>
-      <w:r>
-        <w:rPr>
-          <w:rFonts w:ascii="Times New Roman" w:hAnsi="Times New Roman" w:cs="Times New Roman" w:eastAsia="Times New Roman"/>
-          <w:b/>
-          <w:i/>
-          <w:sz w:val="24"/>
-        </w:rPr>
-        <w:t>Devre Tahtası Yerleşimi</w:t>
-      </w:r>
-    </w:p>
-    <w:p>
-      <w:pPr>
         <w:jc w:val="both"/>
       </w:pPr>
       <w:r>
@@ -761,151 +747,7 @@
           <w:b w:val="0"/>
           <w:i w:val="0"/>
         </w:rPr>
-        <w:t xml:space="preserve">’dur; gerçek değerleri aşağıda ölçülmüştür. </w:t>
-      </w:r>
-      <w:r>
-        <w:rPr>
-          <w:rFonts w:ascii="Times New Roman" w:hAnsi="Times New Roman" w:cs="Times New Roman" w:eastAsia="Times New Roman"/>
-          <w:b w:val="0"/>
-          <w:i w:val="0"/>
-        </w:rPr>
-        <w:t>Şekil 4.1.1</w:t>
-      </w:r>
-      <w:r>
-        <w:rPr>
-          <w:rFonts w:ascii="Times New Roman" w:hAnsi="Times New Roman" w:cs="Times New Roman" w:eastAsia="Times New Roman"/>
-          <w:b w:val="0"/>
-          <w:i w:val="0"/>
-        </w:rPr>
-        <w:t xml:space="preserve">’te dirençlerin seri, </w:t>
-      </w:r>
-      <w:r>
-        <w:rPr>
-          <w:rFonts w:ascii="Times New Roman" w:hAnsi="Times New Roman" w:cs="Times New Roman" w:eastAsia="Times New Roman"/>
-          <w:b w:val="0"/>
-          <w:i w:val="0"/>
-        </w:rPr>
-        <w:t>Şekil 4.1.2</w:t>
-      </w:r>
-      <w:r>
-        <w:rPr>
-          <w:rFonts w:ascii="Times New Roman" w:hAnsi="Times New Roman" w:cs="Times New Roman" w:eastAsia="Times New Roman"/>
-          <w:b w:val="0"/>
-          <w:i w:val="0"/>
-        </w:rPr>
-        <w:t>’te paralel bağlanmış hâlinin devre tahtası yerleşimi görülmektedir. Seri bağlantıda dirençler uç uca takılır; aradaki ortak sütun (a–e delikleri iç bağlıdır) bağlantı noktasıdır. Paralel bağlantıda üç direncin birer ucu aynı sütuna, diğer uçları başka bir ortak sütuna takılır.</w:t>
-      </w:r>
-    </w:p>
-    <w:p>
-      <w:pPr>
-        <w:keepNext/>
-        <w:spacing w:line="240" w:lineRule="auto"/>
-        <w:jc w:val="center"/>
-      </w:pPr>
-      <w:r>
-        <w:drawing>
-          <wp:inline xmlns:a="http://schemas.openxmlformats.org/drawingml/2006/main" xmlns:pic="http://schemas.openxmlformats.org/drawingml/2006/picture">
-            <wp:extent cx="5040000" cy="3864000"/>
-            <wp:docPr id="2" name="Picture 2"/>
-            <wp:cNvGraphicFramePr>
-              <a:graphicFrameLocks noChangeAspect="1"/>
-            </wp:cNvGraphicFramePr>
-            <a:graphic>
-              <a:graphicData uri="http://schemas.openxmlformats.org/drawingml/2006/picture">
-                <pic:pic>
-                  <pic:nvPicPr>
-                    <pic:cNvPr id="0" name="bb_seri.png"/>
-                    <pic:cNvPicPr/>
-                  </pic:nvPicPr>
-                  <pic:blipFill>
-                    <a:blip r:embed="rId11"/>
-                    <a:stretch>
-                      <a:fillRect/>
-                    </a:stretch>
-                  </pic:blipFill>
-                  <pic:spPr>
-                    <a:xfrm>
-                      <a:off x="0" y="0"/>
-                      <a:ext cx="5040000" cy="3864000"/>
-                    </a:xfrm>
-                    <a:prstGeom prst="rect"/>
-                  </pic:spPr>
-                </pic:pic>
-              </a:graphicData>
-            </a:graphic>
-          </wp:inline>
-        </w:drawing>
-      </w:r>
-    </w:p>
-    <w:p>
-      <w:pPr>
-        <w:spacing w:line="240" w:lineRule="auto" w:after="240"/>
-        <w:jc w:val="center"/>
-      </w:pPr>
-      <w:r>
-        <w:rPr>
-          <w:rFonts w:ascii="Times New Roman" w:hAnsi="Times New Roman" w:cs="Times New Roman" w:eastAsia="Times New Roman"/>
-          <w:b w:val="0"/>
-          <w:i w:val="0"/>
-          <w:sz w:val="20"/>
-        </w:rPr>
-        <w:t>Şekil 4.1.1  Dirençlerin seri bağlantısı (devre tahtası yerleşimi). Multimetre Ω kademesinde iki serbest uç arasına bağlanır.</w:t>
-      </w:r>
-    </w:p>
-    <w:p>
-      <w:pPr>
-        <w:keepNext/>
-        <w:spacing w:line="240" w:lineRule="auto"/>
-        <w:jc w:val="center"/>
-      </w:pPr>
-      <w:r>
-        <w:drawing>
-          <wp:inline xmlns:a="http://schemas.openxmlformats.org/drawingml/2006/main" xmlns:pic="http://schemas.openxmlformats.org/drawingml/2006/picture">
-            <wp:extent cx="5040000" cy="3864000"/>
-            <wp:docPr id="3" name="Picture 3"/>
-            <wp:cNvGraphicFramePr>
-              <a:graphicFrameLocks noChangeAspect="1"/>
-            </wp:cNvGraphicFramePr>
-            <a:graphic>
-              <a:graphicData uri="http://schemas.openxmlformats.org/drawingml/2006/picture">
-                <pic:pic>
-                  <pic:nvPicPr>
-                    <pic:cNvPr id="0" name="bb_par.png"/>
-                    <pic:cNvPicPr/>
-                  </pic:nvPicPr>
-                  <pic:blipFill>
-                    <a:blip r:embed="rId12"/>
-                    <a:stretch>
-                      <a:fillRect/>
-                    </a:stretch>
-                  </pic:blipFill>
-                  <pic:spPr>
-                    <a:xfrm>
-                      <a:off x="0" y="0"/>
-                      <a:ext cx="5040000" cy="3864000"/>
-                    </a:xfrm>
-                    <a:prstGeom prst="rect"/>
-                  </pic:spPr>
-                </pic:pic>
-              </a:graphicData>
-            </a:graphic>
-          </wp:inline>
-        </w:drawing>
-      </w:r>
-    </w:p>
-    <w:p>
-      <w:pPr>
-        <w:spacing w:line="240" w:lineRule="auto" w:after="240"/>
-        <w:jc w:val="center"/>
-      </w:pPr>
-      <w:r>
-        <w:rPr>
-          <w:rFonts w:ascii="Times New Roman" w:hAnsi="Times New Roman" w:cs="Times New Roman" w:eastAsia="Times New Roman"/>
-          <w:b w:val="0"/>
-          <w:i w:val="0"/>
-          <w:sz w:val="20"/>
-        </w:rPr>
-        <w:t>Şekil 4.1.2  Dirençlerin paralel bağlantısı (devre tahtası yerleşimi).</w:t>
+        <w:t>’dur; gerçek değerleri aşağıda ölçülmüştür. Seri bağlantıda dirençler uç uca bağlanmış, paralel bağlantıda ise üç direncin birer ucu aynı ortak düğüme, diğer uçları başka bir ortak düğüme bağlanmıştır.</w:t>
       </w:r>
     </w:p>
     <w:p>
@@ -942,7 +784,7 @@
           <w:b w:val="0"/>
           <w:i w:val="0"/>
         </w:rPr>
-        <w:t>Şekil 4.1.3</w:t>
+        <w:t>Şekil 4.1.1</w:t>
       </w:r>
       <w:r>
         <w:rPr>
@@ -958,7 +800,7 @@
           <w:b w:val="0"/>
           <w:i w:val="0"/>
         </w:rPr>
-        <w:t>Şekil 4.1.4</w:t>
+        <w:t>Şekil 4.1.2</w:t>
       </w:r>
       <w:r>
         <w:rPr>
@@ -2090,7 +1932,7 @@
         <w:drawing>
           <wp:inline xmlns:a="http://schemas.openxmlformats.org/drawingml/2006/main" xmlns:pic="http://schemas.openxmlformats.org/drawingml/2006/picture">
             <wp:extent cx="5580000" cy="1398952"/>
-            <wp:docPr id="4" name="Picture 4"/>
+            <wp:docPr id="2" name="Picture 2"/>
             <wp:cNvGraphicFramePr>
               <a:graphicFrameLocks noChangeAspect="1"/>
             </wp:cNvGraphicFramePr>
@@ -2102,7 +1944,7 @@
                     <pic:cNvPicPr/>
                   </pic:nvPicPr>
                   <pic:blipFill>
-                    <a:blip r:embed="rId13"/>
+                    <a:blip r:embed="rId11"/>
                     <a:stretch>
                       <a:fillRect/>
                     </a:stretch>
@@ -2133,7 +1975,7 @@
           <w:i w:val="0"/>
           <w:sz w:val="20"/>
         </w:rPr>
-        <w:t xml:space="preserve">Şekil 4.1.3  Dirençlerin ayrı ayrı ölçümü: </w:t>
+        <w:t xml:space="preserve">Şekil 4.1.1  Dirençlerin ayrı ayrı ölçümü: </w:t>
       </w:r>
       <m:oMath>
         <m:sSub>
@@ -2296,7 +2138,7 @@
         <w:drawing>
           <wp:inline xmlns:a="http://schemas.openxmlformats.org/drawingml/2006/main" xmlns:pic="http://schemas.openxmlformats.org/drawingml/2006/picture">
             <wp:extent cx="4320000" cy="1083059"/>
-            <wp:docPr id="5" name="Picture 5"/>
+            <wp:docPr id="3" name="Picture 3"/>
             <wp:cNvGraphicFramePr>
               <a:graphicFrameLocks noChangeAspect="1"/>
             </wp:cNvGraphicFramePr>
@@ -2308,7 +2150,7 @@
                     <pic:cNvPicPr/>
                   </pic:nvPicPr>
                   <pic:blipFill>
-                    <a:blip r:embed="rId14"/>
+                    <a:blip r:embed="rId12"/>
                     <a:stretch>
                       <a:fillRect/>
                     </a:stretch>
@@ -2339,7 +2181,7 @@
           <w:i w:val="0"/>
           <w:sz w:val="20"/>
         </w:rPr>
-        <w:t>Şekil 4.1.4  Seri bağlantının (</w:t>
+        <w:t>Şekil 4.1.2  Seri bağlantının (</w:t>
       </w:r>
       <m:oMath>
         <m:r>
@@ -3532,7 +3374,7 @@
           <w:i/>
           <w:sz w:val="24"/>
         </w:rPr>
-        <w:t>Devre ve Devre Tahtası Yerleşimi</w:t>
+        <w:t>Devre Şeması</w:t>
       </w:r>
     </w:p>
     <w:p>
@@ -3611,7 +3453,7 @@
           <w:b w:val="0"/>
           <w:i w:val="0"/>
         </w:rPr>
-        <w:t xml:space="preserve"> alt dirençten alınır. Devre tahtası yerleşimi </w:t>
+        <w:t xml:space="preserve"> alt dirençten alınır. Devre şeması </w:t>
       </w:r>
       <w:r>
         <w:rPr>
@@ -3721,8 +3563,8 @@
       <w:r>
         <w:drawing>
           <wp:inline xmlns:a="http://schemas.openxmlformats.org/drawingml/2006/main" xmlns:pic="http://schemas.openxmlformats.org/drawingml/2006/picture">
-            <wp:extent cx="5040000" cy="3864000"/>
-            <wp:docPr id="6" name="Picture 6"/>
+            <wp:extent cx="2700000" cy="1687500"/>
+            <wp:docPr id="4" name="Picture 4"/>
             <wp:cNvGraphicFramePr>
               <a:graphicFrameLocks noChangeAspect="1"/>
             </wp:cNvGraphicFramePr>
@@ -3730,11 +3572,11 @@
               <a:graphicData uri="http://schemas.openxmlformats.org/drawingml/2006/picture">
                 <pic:pic>
                   <pic:nvPicPr>
-                    <pic:cNvPr id="0" name="bb_bol.png"/>
+                    <pic:cNvPr id="0" name="foy_sch_bol.png"/>
                     <pic:cNvPicPr/>
                   </pic:nvPicPr>
                   <pic:blipFill>
-                    <a:blip r:embed="rId15"/>
+                    <a:blip r:embed="rId13"/>
                     <a:stretch>
                       <a:fillRect/>
                     </a:stretch>
@@ -3742,7 +3584,7 @@
                   <pic:spPr>
                     <a:xfrm>
                       <a:off x="0" y="0"/>
-                      <a:ext cx="5040000" cy="3864000"/>
+                      <a:ext cx="2700000" cy="1687500"/>
                     </a:xfrm>
                     <a:prstGeom prst="rect"/>
                   </pic:spPr>
@@ -3765,7 +3607,7 @@
           <w:i w:val="0"/>
           <w:sz w:val="20"/>
         </w:rPr>
-        <w:t xml:space="preserve">Şekil 4.2.1  Gerilim bölücü devrenin devre tahtası yerleşimi. Güç kaynağı 15 V’a ayarlıdır; </w:t>
+        <w:t xml:space="preserve">Şekil 4.2.1  Gerilim bölücü devre şeması (föy Şekil 1). Güç kaynağı 15 V’a ayarlıdır; </w:t>
       </w:r>
       <m:oMath>
         <m:sSub>
@@ -3788,7 +3630,7 @@
           <w:i w:val="0"/>
           <w:sz w:val="20"/>
         </w:rPr>
-        <w:t xml:space="preserve"> düğümünü multimetre ve osiloskop ölçer (iki alet aynı düğüme bağlıdır). Çizimde 470 Ω’luk dirençler gösterilmiştir.</w:t>
+        <w:t xml:space="preserve"> düğümünü multimetre ve osiloskop ölçer (iki alet aynı düğüme bağlıdır).</w:t>
       </w:r>
     </w:p>
     <w:p>
@@ -5915,7 +5757,7 @@
         <w:drawing>
           <wp:inline xmlns:a="http://schemas.openxmlformats.org/drawingml/2006/main" xmlns:pic="http://schemas.openxmlformats.org/drawingml/2006/picture">
             <wp:extent cx="5580000" cy="1398952"/>
-            <wp:docPr id="7" name="Picture 7"/>
+            <wp:docPr id="5" name="Picture 5"/>
             <wp:cNvGraphicFramePr>
               <a:graphicFrameLocks noChangeAspect="1"/>
             </wp:cNvGraphicFramePr>
@@ -5927,7 +5769,7 @@
                     <pic:cNvPicPr/>
                   </pic:nvPicPr>
                   <pic:blipFill>
-                    <a:blip r:embed="rId16"/>
+                    <a:blip r:embed="rId14"/>
                     <a:stretch>
                       <a:fillRect/>
                     </a:stretch>
@@ -6049,7 +5891,7 @@
         <w:drawing>
           <wp:inline xmlns:a="http://schemas.openxmlformats.org/drawingml/2006/main" xmlns:pic="http://schemas.openxmlformats.org/drawingml/2006/picture">
             <wp:extent cx="4860000" cy="3645000"/>
-            <wp:docPr id="8" name="Picture 8"/>
+            <wp:docPr id="6" name="Picture 6"/>
             <wp:cNvGraphicFramePr>
               <a:graphicFrameLocks noChangeAspect="1"/>
             </wp:cNvGraphicFramePr>
@@ -6061,7 +5903,7 @@
                     <pic:cNvPicPr/>
                   </pic:nvPicPr>
                   <pic:blipFill>
-                    <a:blip r:embed="rId17"/>
+                    <a:blip r:embed="rId15"/>
                     <a:stretch>
                       <a:fillRect/>
                     </a:stretch>
@@ -6134,7 +5976,7 @@
         <w:drawing>
           <wp:inline xmlns:a="http://schemas.openxmlformats.org/drawingml/2006/main" xmlns:pic="http://schemas.openxmlformats.org/drawingml/2006/picture">
             <wp:extent cx="4860000" cy="3645000"/>
-            <wp:docPr id="9" name="Picture 9"/>
+            <wp:docPr id="7" name="Picture 7"/>
             <wp:cNvGraphicFramePr>
               <a:graphicFrameLocks noChangeAspect="1"/>
             </wp:cNvGraphicFramePr>
@@ -6146,7 +5988,7 @@
                     <pic:cNvPicPr/>
                   </pic:nvPicPr>
                   <pic:blipFill>
-                    <a:blip r:embed="rId18"/>
+                    <a:blip r:embed="rId16"/>
                     <a:stretch>
                       <a:fillRect/>
                     </a:stretch>
@@ -6228,7 +6070,7 @@
         <w:drawing>
           <wp:inline xmlns:a="http://schemas.openxmlformats.org/drawingml/2006/main" xmlns:pic="http://schemas.openxmlformats.org/drawingml/2006/picture">
             <wp:extent cx="4860000" cy="3645000"/>
-            <wp:docPr id="10" name="Picture 10"/>
+            <wp:docPr id="8" name="Picture 8"/>
             <wp:cNvGraphicFramePr>
               <a:graphicFrameLocks noChangeAspect="1"/>
             </wp:cNvGraphicFramePr>
@@ -6240,7 +6082,7 @@
                     <pic:cNvPicPr/>
                   </pic:nvPicPr>
                   <pic:blipFill>
-                    <a:blip r:embed="rId19"/>
+                    <a:blip r:embed="rId17"/>
                     <a:stretch>
                       <a:fillRect/>
                     </a:stretch>
@@ -11035,7 +10877,7 @@
           <w:i/>
           <w:sz w:val="24"/>
         </w:rPr>
-        <w:t>Devre ve Devre Tahtası Yerleşimi</w:t>
+        <w:t>Devre Şeması</w:t>
       </w:r>
     </w:p>
     <w:p>
@@ -11184,7 +11026,7 @@
           <w:b w:val="0"/>
           <w:i w:val="0"/>
         </w:rPr>
-        <w:t xml:space="preserve"> yerine laboratuvar asistanının verdiği bilinmeyen direnç bağlanmıştır. Devre tahtası yerleşimi </w:t>
+        <w:t xml:space="preserve"> yerine laboratuvar asistanının verdiği bilinmeyen direnç bağlanmıştır. Devre şeması </w:t>
       </w:r>
       <w:r>
         <w:rPr>
@@ -11322,8 +11164,8 @@
       <w:r>
         <w:drawing>
           <wp:inline xmlns:a="http://schemas.openxmlformats.org/drawingml/2006/main" xmlns:pic="http://schemas.openxmlformats.org/drawingml/2006/picture">
-            <wp:extent cx="5040000" cy="3864000"/>
-            <wp:docPr id="11" name="Picture 11"/>
+            <wp:extent cx="3060000" cy="1850000"/>
+            <wp:docPr id="9" name="Picture 9"/>
             <wp:cNvGraphicFramePr>
               <a:graphicFrameLocks noChangeAspect="1"/>
             </wp:cNvGraphicFramePr>
@@ -11331,11 +11173,11 @@
               <a:graphicData uri="http://schemas.openxmlformats.org/drawingml/2006/picture">
                 <pic:pic>
                   <pic:nvPicPr>
-                    <pic:cNvPr id="0" name="bb_whe.png"/>
+                    <pic:cNvPr id="0" name="foy_sch_whe.png"/>
                     <pic:cNvPicPr/>
                   </pic:nvPicPr>
                   <pic:blipFill>
-                    <a:blip r:embed="rId20"/>
+                    <a:blip r:embed="rId18"/>
                     <a:stretch>
                       <a:fillRect/>
                     </a:stretch>
@@ -11343,7 +11185,7 @@
                   <pic:spPr>
                     <a:xfrm>
                       <a:off x="0" y="0"/>
-                      <a:ext cx="5040000" cy="3864000"/>
+                      <a:ext cx="3060000" cy="1850000"/>
                     </a:xfrm>
                     <a:prstGeom prst="rect"/>
                   </pic:spPr>
@@ -11366,7 +11208,7 @@
           <w:i w:val="0"/>
           <w:sz w:val="20"/>
         </w:rPr>
-        <w:t xml:space="preserve">Şekil 4.3.1  Wheatstone köprüsünün devre tahtası yerleşimi. Potansiyometre </w:t>
+        <w:t xml:space="preserve">Şekil 4.3.1  Wheatstone köprüsü devre şeması (föy Şekil 2). Potansiyometre </w:t>
       </w:r>
       <m:oMath>
         <m:sSub>
@@ -12469,7 +12311,7 @@
         <w:drawing>
           <wp:inline xmlns:a="http://schemas.openxmlformats.org/drawingml/2006/main" xmlns:pic="http://schemas.openxmlformats.org/drawingml/2006/picture">
             <wp:extent cx="5580000" cy="2797904"/>
-            <wp:docPr id="12" name="Picture 12"/>
+            <wp:docPr id="10" name="Picture 10"/>
             <wp:cNvGraphicFramePr>
               <a:graphicFrameLocks noChangeAspect="1"/>
             </wp:cNvGraphicFramePr>
@@ -12481,7 +12323,7 @@
                     <pic:cNvPicPr/>
                   </pic:nvPicPr>
                   <pic:blipFill>
-                    <a:blip r:embed="rId21"/>
+                    <a:blip r:embed="rId19"/>
                     <a:stretch>
                       <a:fillRect/>
                     </a:stretch>
@@ -14321,7 +14163,7 @@
           <w:i/>
           <w:sz w:val="24"/>
         </w:rPr>
-        <w:t>Devre ve Devre Tahtası Yerleşimi</w:t>
+        <w:t>Devre Şeması</w:t>
       </w:r>
     </w:p>
     <w:p>
@@ -14464,7 +14306,7 @@
           <w:b w:val="0"/>
           <w:i w:val="0"/>
         </w:rPr>
-        <w:t xml:space="preserve">’luk yük direncinden oluşur. Mantık “1” için girişe 16 V, “0” için toprağa bağlanmıştır. Devre tahtası yerleşimi </w:t>
+        <w:t xml:space="preserve">’luk yük direncinden oluşur. Mantık “1” için girişe 16 V, “0” için toprağa bağlanmıştır. Devre şeması </w:t>
       </w:r>
       <w:r>
         <w:rPr>
@@ -14480,7 +14322,7 @@
           <w:b w:val="0"/>
           <w:i w:val="0"/>
         </w:rPr>
-        <w:t>’dedir.</w:t>
+        <w:t>’de görülmektedir.</w:t>
       </w:r>
     </w:p>
     <w:p>
@@ -14492,8 +14334,8 @@
       <w:r>
         <w:drawing>
           <wp:inline xmlns:a="http://schemas.openxmlformats.org/drawingml/2006/main" xmlns:pic="http://schemas.openxmlformats.org/drawingml/2006/picture">
-            <wp:extent cx="5040000" cy="3864000"/>
-            <wp:docPr id="13" name="Picture 13"/>
+            <wp:extent cx="3240000" cy="2400000"/>
+            <wp:docPr id="11" name="Picture 11"/>
             <wp:cNvGraphicFramePr>
               <a:graphicFrameLocks noChangeAspect="1"/>
             </wp:cNvGraphicFramePr>
@@ -14501,11 +14343,11 @@
               <a:graphicData uri="http://schemas.openxmlformats.org/drawingml/2006/picture">
                 <pic:pic>
                   <pic:nvPicPr>
-                    <pic:cNvPr id="0" name="bb_dac.png"/>
+                    <pic:cNvPr id="0" name="foy_sch_dac.png"/>
                     <pic:cNvPicPr/>
                   </pic:nvPicPr>
                   <pic:blipFill>
-                    <a:blip r:embed="rId22"/>
+                    <a:blip r:embed="rId20"/>
                     <a:stretch>
                       <a:fillRect/>
                     </a:stretch>
@@ -14513,7 +14355,7 @@
                   <pic:spPr>
                     <a:xfrm>
                       <a:off x="0" y="0"/>
-                      <a:ext cx="5040000" cy="3864000"/>
+                      <a:ext cx="3240000" cy="2400000"/>
                     </a:xfrm>
                     <a:prstGeom prst="rect"/>
                   </pic:spPr>
@@ -14536,211 +14378,7 @@
           <w:i w:val="0"/>
           <w:sz w:val="20"/>
         </w:rPr>
-        <w:t xml:space="preserve">Şekil 4.4.1  3 bitlik R-2R DAC’ın devre tahtası yerleşimi. </w:t>
-      </w:r>
-      <m:oMath>
-        <m:sSub>
-          <m:e>
-            <m:r>
-              <m:t>R</m:t>
-            </m:r>
-          </m:e>
-          <m:sub>
-            <m:r>
-              <m:t>i</m:t>
-            </m:r>
-            <m:r>
-              <m:t>1</m:t>
-            </m:r>
-          </m:sub>
-        </m:sSub>
-        <m:r>
-          <m:rPr>
-            <m:sty m:val="p"/>
-          </m:rPr>
-          <m:t>,</m:t>
-        </m:r>
-        <m:sSub>
-          <m:e>
-            <m:r>
-              <m:t>R</m:t>
-            </m:r>
-          </m:e>
-          <m:sub>
-            <m:r>
-              <m:t>i</m:t>
-            </m:r>
-            <m:r>
-              <m:t>2</m:t>
-            </m:r>
-          </m:sub>
-        </m:sSub>
-        <m:r>
-          <m:rPr>
-            <m:sty m:val="p"/>
-          </m:rPr>
-          <m:t>,</m:t>
-        </m:r>
-        <m:sSub>
-          <m:e>
-            <m:r>
-              <m:t>R</m:t>
-            </m:r>
-          </m:e>
-          <m:sub>
-            <m:r>
-              <m:t>i</m:t>
-            </m:r>
-            <m:r>
-              <m:t>3</m:t>
-            </m:r>
-          </m:sub>
-        </m:sSub>
-        <m:r>
-          <m:rPr>
-            <m:sty m:val="p"/>
-          </m:rPr>
-          <m:t>=</m:t>
-        </m:r>
-        <m:r>
-          <m:t>2</m:t>
-        </m:r>
-        <m:r>
-          <m:t> </m:t>
-        </m:r>
-        <m:r>
-          <m:rPr>
-            <m:sty m:val="p"/>
-          </m:rPr>
-          <m:t>k</m:t>
-        </m:r>
-        <m:r>
-          <m:rPr>
-            <m:sty m:val="p"/>
-          </m:rPr>
-          <m:t>Ω</m:t>
-        </m:r>
-      </m:oMath>
-      <w:r>
-        <w:rPr>
-          <w:rFonts w:ascii="Times New Roman" w:hAnsi="Times New Roman" w:cs="Times New Roman" w:eastAsia="Times New Roman"/>
-          <w:b w:val="0"/>
-          <w:i w:val="0"/>
-          <w:sz w:val="20"/>
-        </w:rPr>
-        <w:t xml:space="preserve"> (giriş), </w:t>
-      </w:r>
-      <m:oMath>
-        <m:sSub>
-          <m:e>
-            <m:r>
-              <m:t>R</m:t>
-            </m:r>
-          </m:e>
-          <m:sub>
-            <m:r>
-              <m:t>a</m:t>
-            </m:r>
-          </m:sub>
-        </m:sSub>
-        <m:r>
-          <m:rPr>
-            <m:sty m:val="p"/>
-          </m:rPr>
-          <m:t>=</m:t>
-        </m:r>
-        <m:sSub>
-          <m:e>
-            <m:r>
-              <m:t>R</m:t>
-            </m:r>
-          </m:e>
-          <m:sub>
-            <m:r>
-              <m:t>b</m:t>
-            </m:r>
-          </m:sub>
-        </m:sSub>
-        <m:r>
-          <m:rPr>
-            <m:sty m:val="p"/>
-          </m:rPr>
-          <m:t>=</m:t>
-        </m:r>
-        <m:r>
-          <m:t>1</m:t>
-        </m:r>
-        <m:r>
-          <m:t> </m:t>
-        </m:r>
-        <m:r>
-          <m:rPr>
-            <m:sty m:val="p"/>
-          </m:rPr>
-          <m:t>k</m:t>
-        </m:r>
-        <m:r>
-          <m:rPr>
-            <m:sty m:val="p"/>
-          </m:rPr>
-          <m:t>Ω</m:t>
-        </m:r>
-      </m:oMath>
-      <w:r>
-        <w:rPr>
-          <w:rFonts w:ascii="Times New Roman" w:hAnsi="Times New Roman" w:cs="Times New Roman" w:eastAsia="Times New Roman"/>
-          <w:b w:val="0"/>
-          <w:i w:val="0"/>
-          <w:sz w:val="20"/>
-        </w:rPr>
-        <w:t xml:space="preserve">, </w:t>
-      </w:r>
-      <m:oMath>
-        <m:sSub>
-          <m:e>
-            <m:r>
-              <m:t>R</m:t>
-            </m:r>
-          </m:e>
-          <m:sub>
-            <m:r>
-              <m:t>t</m:t>
-            </m:r>
-          </m:sub>
-        </m:sSub>
-        <m:r>
-          <m:rPr>
-            <m:sty m:val="p"/>
-          </m:rPr>
-          <m:t>=</m:t>
-        </m:r>
-        <m:r>
-          <m:t>2</m:t>
-        </m:r>
-        <m:r>
-          <m:t> </m:t>
-        </m:r>
-        <m:r>
-          <m:rPr>
-            <m:sty m:val="p"/>
-          </m:rPr>
-          <m:t>k</m:t>
-        </m:r>
-        <m:r>
-          <m:rPr>
-            <m:sty m:val="p"/>
-          </m:rPr>
-          <m:t>Ω</m:t>
-        </m:r>
-      </m:oMath>
-      <w:r>
-        <w:rPr>
-          <w:rFonts w:ascii="Times New Roman" w:hAnsi="Times New Roman" w:cs="Times New Roman" w:eastAsia="Times New Roman"/>
-          <w:b w:val="0"/>
-          <w:i w:val="0"/>
-          <w:sz w:val="20"/>
-        </w:rPr>
-        <w:t xml:space="preserve">, </w:t>
+        <w:t xml:space="preserve">Şekil 4.4.1  3 bitlik R-2R DAC devre şeması (föy Şekil 3). Her giriş 16 V (mantık 1) veya toprağa (mantık 0) bağlanır; </w:t>
       </w:r>
       <m:oMath>
         <m:sSub>
@@ -14787,30 +14425,7 @@
           <w:i w:val="0"/>
           <w:sz w:val="20"/>
         </w:rPr>
-        <w:t xml:space="preserve">. Turuncu jumperlar girişleri 16 V rayına (mantık 1, kod 111) bağlar; bir bit 0 olacaksa jumper alt rayına (toprağa) taşınır. Multimetre </w:t>
-      </w:r>
-      <m:oMath>
-        <m:sSub>
-          <m:e>
-            <m:r>
-              <m:t>V</m:t>
-            </m:r>
-          </m:e>
-          <m:sub>
-            <m:r>
-              <m:t>O</m:t>
-            </m:r>
-          </m:sub>
-        </m:sSub>
-      </m:oMath>
-      <w:r>
-        <w:rPr>
-          <w:rFonts w:ascii="Times New Roman" w:hAnsi="Times New Roman" w:cs="Times New Roman" w:eastAsia="Times New Roman"/>
-          <w:b w:val="0"/>
-          <w:i w:val="0"/>
-          <w:sz w:val="20"/>
-        </w:rPr>
-        <w:t xml:space="preserve"> düğümündedir.</w:t>
+        <w:t xml:space="preserve"> çıkış yüküdür.</w:t>
       </w:r>
     </w:p>
     <w:p>
@@ -17346,7 +16961,7 @@
         <w:drawing>
           <wp:inline xmlns:a="http://schemas.openxmlformats.org/drawingml/2006/main" xmlns:pic="http://schemas.openxmlformats.org/drawingml/2006/picture">
             <wp:extent cx="5580000" cy="1398952"/>
-            <wp:docPr id="14" name="Picture 14"/>
+            <wp:docPr id="12" name="Picture 12"/>
             <wp:cNvGraphicFramePr>
               <a:graphicFrameLocks noChangeAspect="1"/>
             </wp:cNvGraphicFramePr>
@@ -17358,7 +16973,7 @@
                     <pic:cNvPicPr/>
                   </pic:nvPicPr>
                   <pic:blipFill>
-                    <a:blip r:embed="rId23"/>
+                    <a:blip r:embed="rId21"/>
                     <a:stretch>
                       <a:fillRect/>
                     </a:stretch>
@@ -19365,7 +18980,7 @@
           <w:b w:val="0"/>
           <w:i w:val="0"/>
         </w:rPr>
-        <w:t xml:space="preserve"> Seri-paralel direnç hesabı ve ölçümü; ölçü aletinin yük etkisinin hesaplanması; osiloskop ve multimetrenin birlikte kullanımı ve 50 Hz parazitin tanınması; köprü yöntemi; DAC ağırlıklarının süperpozisyonla hesabı; devre tahtası yerleşimi ve ölçümlerinin beklenen değerle yüzde farkla karşılaştırılması.</w:t>
+        <w:t xml:space="preserve"> Seri-paralel direnç hesabı ve ölçümü; ölçü aletinin yük etkisinin hesaplanması; osiloskop ve multimetrenin birlikte kullanımı ve 50 Hz parazitin tanınması; köprü yöntemi; DAC ağırlıklarının süperpozisyonla hesabı; devre şemasının kurulması ve ölçümlerinin beklenen değerle yüzde farkla karşılaştırılması.</w:t>
       </w:r>
     </w:p>
     <w:p>
@@ -19869,7 +19484,7 @@
         <w:drawing>
           <wp:inline xmlns:a="http://schemas.openxmlformats.org/drawingml/2006/main" xmlns:pic="http://schemas.openxmlformats.org/drawingml/2006/picture">
             <wp:extent cx="4680000" cy="2925000"/>
-            <wp:docPr id="15" name="Picture 15"/>
+            <wp:docPr id="13" name="Picture 13"/>
             <wp:cNvGraphicFramePr>
               <a:graphicFrameLocks noChangeAspect="1"/>
             </wp:cNvGraphicFramePr>
@@ -19881,7 +19496,7 @@
                     <pic:cNvPicPr/>
                   </pic:nvPicPr>
                   <pic:blipFill>
-                    <a:blip r:embed="rId24"/>
+                    <a:blip r:embed="rId22"/>
                     <a:stretch>
                       <a:fillRect/>
                     </a:stretch>
@@ -19925,7 +19540,7 @@
         <w:drawing>
           <wp:inline xmlns:a="http://schemas.openxmlformats.org/drawingml/2006/main" xmlns:pic="http://schemas.openxmlformats.org/drawingml/2006/picture">
             <wp:extent cx="4680000" cy="2827500"/>
-            <wp:docPr id="16" name="Picture 16"/>
+            <wp:docPr id="14" name="Picture 14"/>
             <wp:cNvGraphicFramePr>
               <a:graphicFrameLocks noChangeAspect="1"/>
             </wp:cNvGraphicFramePr>
@@ -19937,7 +19552,7 @@
                     <pic:cNvPicPr/>
                   </pic:nvPicPr>
                   <pic:blipFill>
-                    <a:blip r:embed="rId25"/>
+                    <a:blip r:embed="rId23"/>
                     <a:stretch>
                       <a:fillRect/>
                     </a:stretch>
@@ -19981,7 +19596,7 @@
         <w:drawing>
           <wp:inline xmlns:a="http://schemas.openxmlformats.org/drawingml/2006/main" xmlns:pic="http://schemas.openxmlformats.org/drawingml/2006/picture">
             <wp:extent cx="4860000" cy="1905882"/>
-            <wp:docPr id="17" name="Picture 17"/>
+            <wp:docPr id="15" name="Picture 15"/>
             <wp:cNvGraphicFramePr>
               <a:graphicFrameLocks noChangeAspect="1"/>
             </wp:cNvGraphicFramePr>
@@ -19993,7 +19608,7 @@
                     <pic:cNvPicPr/>
                   </pic:nvPicPr>
                   <pic:blipFill>
-                    <a:blip r:embed="rId26"/>
+                    <a:blip r:embed="rId24"/>
                     <a:stretch>
                       <a:fillRect/>
                     </a:stretch>

</xml_diff>